<commit_message>
German Part 3: expand episodes 28-36 with added scenes; rebuild Word and PDF
Co-Authored-By: Claude Sonnet 5.5 <noreply@anthropic.com>
Claude-Session: https://claude.ai/code/session_0122DR5hMtGscXEbtr8Pz4Xq
</commit_message>
<xml_diff>
--- a/문장별_해설/3부_32화_Durchsuchung_해설.docx
+++ b/문장별_해설/3부_32화_Durchsuchung_해설.docx
@@ -26,7 +26,7 @@
           <w:color w:val="595959"/>
           <w:sz w:val="20"/>
         </w:rPr>
-        <w:t>대화문 28턴 — 문장별 주요 단어 · 문법 · 표현 · 시제 해설</w:t>
+        <w:t>대화문 39턴 — 문장별 주요 단어 · 문법 · 표현 · 시제 해설</w:t>
       </w:r>
     </w:p>
     <w:p>
@@ -41,7 +41,619 @@
           <w:i w:val="0"/>
           <w:sz w:val="22"/>
         </w:rPr>
-        <w:t>1. Jonas: Dienstagmorgen, kurz vor sieben. Mein Handy vibriert so heftig, dass es fast vom Nachttisch fällt. Sophie.</w:t>
+        <w:t>1. Jonas: In der Nacht davor habe ich schlecht geschlafen. Ich träumte von einem Gebäude aus Glas, das von innen leer war, und von einem Mann, der darin immer wieder dieselben Treppen hinaufstieg.</w:t>
+      </w:r>
+    </w:p>
+    <w:p>
+      <w:pPr>
+        <w:keepNext/>
+        <w:ind w:left="340"/>
+      </w:pPr>
+      <w:r>
+        <w:rPr>
+          <w:rFonts w:ascii="Malgun Gothic" w:hAnsi="Malgun Gothic" w:cs="Malgun Gothic" w:eastAsia="Malgun Gothic"/>
+          <w:b w:val="0"/>
+          <w:i/>
+          <w:color w:val="404040"/>
+          <w:sz w:val="20"/>
+        </w:rPr>
+        <w:t>그 전날 밤에는 잘 자지 못했다. 안이 텅 빈 유리 건물과 그 안에서 같은 계단을 계속 오르는 남자의 꿈을 꿨다.</w:t>
+      </w:r>
+    </w:p>
+    <w:tbl>
+      <w:tblPr>
+        <w:tblW w:type="auto" w:w="0"/>
+        <w:tblLayout w:type="fixed"/>
+        <w:tblLook w:firstColumn="1" w:firstRow="1" w:lastColumn="0" w:lastRow="0" w:noHBand="0" w:noVBand="1" w:val="04A0"/>
+      </w:tblPr>
+      <w:tblGrid>
+        <w:gridCol w:w="4819"/>
+        <w:gridCol w:w="4819"/>
+      </w:tblGrid>
+      <w:tr>
+        <w:tc>
+          <w:tcPr>
+            <w:tcW w:type="dxa" w:w="1500"/>
+            <w:tcBorders>
+              <w:top w:val="single" w:color="BFBFBF" w:sz="4"/>
+              <w:left w:val="single" w:color="BFBFBF" w:sz="4"/>
+              <w:bottom w:val="single" w:color="BFBFBF" w:sz="4"/>
+              <w:right w:val="single" w:color="BFBFBF" w:sz="4"/>
+            </w:tcBorders>
+            <w:shd w:fill="DEEAF6" w:color="auto" w:val="clear"/>
+          </w:tcPr>
+          <w:p>
+            <w:r>
+              <w:rPr>
+                <w:rFonts w:ascii="Malgun Gothic" w:hAnsi="Malgun Gothic" w:cs="Malgun Gothic" w:eastAsia="Malgun Gothic"/>
+                <w:b/>
+                <w:i w:val="0"/>
+                <w:color w:val="1F3864"/>
+                <w:sz w:val="20"/>
+              </w:rPr>
+              <w:t>주요 단어</w:t>
+            </w:r>
+          </w:p>
+        </w:tc>
+        <w:tc>
+          <w:tcPr>
+            <w:tcW w:type="dxa" w:w="8138"/>
+            <w:tcBorders>
+              <w:top w:val="single" w:color="BFBFBF" w:sz="4"/>
+              <w:left w:val="single" w:color="BFBFBF" w:sz="4"/>
+              <w:bottom w:val="single" w:color="BFBFBF" w:sz="4"/>
+              <w:right w:val="single" w:color="BFBFBF" w:sz="4"/>
+            </w:tcBorders>
+          </w:tcPr>
+          <w:p>
+            <w:pPr>
+              <w:spacing w:after="40"/>
+            </w:pPr>
+            <w:r>
+              <w:rPr>
+                <w:rFonts w:ascii="Arial" w:hAnsi="Arial" w:cs="Arial" w:eastAsia="Malgun Gothic"/>
+                <w:b/>
+                <w:i w:val="0"/>
+                <w:sz w:val="20"/>
+              </w:rPr>
+              <w:t>träumen</w:t>
+            </w:r>
+            <w:r>
+              <w:rPr>
+                <w:rFonts w:ascii="Malgun Gothic" w:hAnsi="Malgun Gothic" w:cs="Malgun Gothic" w:eastAsia="Malgun Gothic"/>
+                <w:b w:val="0"/>
+                <w:i w:val="0"/>
+                <w:sz w:val="20"/>
+              </w:rPr>
+              <w:t xml:space="preserve">  —  꿈꾸다</w:t>
+            </w:r>
+          </w:p>
+          <w:p>
+            <w:pPr>
+              <w:spacing w:after="40"/>
+            </w:pPr>
+            <w:r>
+              <w:rPr>
+                <w:rFonts w:ascii="Arial" w:hAnsi="Arial" w:cs="Arial" w:eastAsia="Malgun Gothic"/>
+                <w:b/>
+                <w:i w:val="0"/>
+                <w:sz w:val="20"/>
+              </w:rPr>
+              <w:t>das Gebäude, -</w:t>
+            </w:r>
+            <w:r>
+              <w:rPr>
+                <w:rFonts w:ascii="Malgun Gothic" w:hAnsi="Malgun Gothic" w:cs="Malgun Gothic" w:eastAsia="Malgun Gothic"/>
+                <w:b w:val="0"/>
+                <w:i w:val="0"/>
+                <w:sz w:val="20"/>
+              </w:rPr>
+              <w:t xml:space="preserve">  —  건물</w:t>
+            </w:r>
+          </w:p>
+          <w:p>
+            <w:pPr>
+              <w:spacing w:after="40"/>
+            </w:pPr>
+            <w:r>
+              <w:rPr>
+                <w:rFonts w:ascii="Arial" w:hAnsi="Arial" w:cs="Arial" w:eastAsia="Malgun Gothic"/>
+                <w:b/>
+                <w:i w:val="0"/>
+                <w:sz w:val="20"/>
+              </w:rPr>
+              <w:t>hinaufsteigen</w:t>
+            </w:r>
+            <w:r>
+              <w:rPr>
+                <w:rFonts w:ascii="Malgun Gothic" w:hAnsi="Malgun Gothic" w:cs="Malgun Gothic" w:eastAsia="Malgun Gothic"/>
+                <w:b w:val="0"/>
+                <w:i w:val="0"/>
+                <w:sz w:val="20"/>
+              </w:rPr>
+              <w:t xml:space="preserve">  —  올라가다</w:t>
+            </w:r>
+          </w:p>
+        </w:tc>
+      </w:tr>
+      <w:tr>
+        <w:tc>
+          <w:tcPr>
+            <w:tcW w:type="dxa" w:w="1500"/>
+            <w:tcBorders>
+              <w:top w:val="single" w:color="BFBFBF" w:sz="4"/>
+              <w:left w:val="single" w:color="BFBFBF" w:sz="4"/>
+              <w:bottom w:val="single" w:color="BFBFBF" w:sz="4"/>
+              <w:right w:val="single" w:color="BFBFBF" w:sz="4"/>
+            </w:tcBorders>
+            <w:shd w:fill="DEEAF6" w:color="auto" w:val="clear"/>
+          </w:tcPr>
+          <w:p>
+            <w:r>
+              <w:rPr>
+                <w:rFonts w:ascii="Malgun Gothic" w:hAnsi="Malgun Gothic" w:cs="Malgun Gothic" w:eastAsia="Malgun Gothic"/>
+                <w:b/>
+                <w:i w:val="0"/>
+                <w:color w:val="1F3864"/>
+                <w:sz w:val="20"/>
+              </w:rPr>
+              <w:t>문법</w:t>
+            </w:r>
+          </w:p>
+        </w:tc>
+        <w:tc>
+          <w:tcPr>
+            <w:tcW w:type="dxa" w:w="8138"/>
+            <w:tcBorders>
+              <w:top w:val="single" w:color="BFBFBF" w:sz="4"/>
+              <w:left w:val="single" w:color="BFBFBF" w:sz="4"/>
+              <w:bottom w:val="single" w:color="BFBFBF" w:sz="4"/>
+              <w:right w:val="single" w:color="BFBFBF" w:sz="4"/>
+            </w:tcBorders>
+          </w:tcPr>
+          <w:p>
+            <w:pPr>
+              <w:spacing w:after="40"/>
+            </w:pPr>
+            <w:r>
+              <w:rPr>
+                <w:rFonts w:ascii="Malgun Gothic" w:hAnsi="Malgun Gothic" w:cs="Malgun Gothic" w:eastAsia="Malgun Gothic"/>
+                <w:b w:val="0"/>
+                <w:i w:val="0"/>
+                <w:sz w:val="20"/>
+              </w:rPr>
+              <w:t>Ich träumte von einem Gebäude aus Glas, das von innen leer war에서 träumen von + 3격이 쓰이고 관계절의 war가 끝에 옵니다. immer wieder는 거듭이라는 표현입니다.</w:t>
+            </w:r>
+          </w:p>
+        </w:tc>
+      </w:tr>
+      <w:tr>
+        <w:tc>
+          <w:tcPr>
+            <w:tcW w:type="dxa" w:w="1500"/>
+            <w:tcBorders>
+              <w:top w:val="single" w:color="BFBFBF" w:sz="4"/>
+              <w:left w:val="single" w:color="BFBFBF" w:sz="4"/>
+              <w:bottom w:val="single" w:color="BFBFBF" w:sz="4"/>
+              <w:right w:val="single" w:color="BFBFBF" w:sz="4"/>
+            </w:tcBorders>
+            <w:shd w:fill="DEEAF6" w:color="auto" w:val="clear"/>
+          </w:tcPr>
+          <w:p>
+            <w:r>
+              <w:rPr>
+                <w:rFonts w:ascii="Malgun Gothic" w:hAnsi="Malgun Gothic" w:cs="Malgun Gothic" w:eastAsia="Malgun Gothic"/>
+                <w:b/>
+                <w:i w:val="0"/>
+                <w:color w:val="1F3864"/>
+                <w:sz w:val="20"/>
+              </w:rPr>
+              <w:t>표현</w:t>
+            </w:r>
+          </w:p>
+        </w:tc>
+        <w:tc>
+          <w:tcPr>
+            <w:tcW w:type="dxa" w:w="8138"/>
+            <w:tcBorders>
+              <w:top w:val="single" w:color="BFBFBF" w:sz="4"/>
+              <w:left w:val="single" w:color="BFBFBF" w:sz="4"/>
+              <w:bottom w:val="single" w:color="BFBFBF" w:sz="4"/>
+              <w:right w:val="single" w:color="BFBFBF" w:sz="4"/>
+            </w:tcBorders>
+          </w:tcPr>
+          <w:p>
+            <w:pPr>
+              <w:spacing w:after="40"/>
+            </w:pPr>
+            <w:r>
+              <w:rPr>
+                <w:rFonts w:ascii="Malgun Gothic" w:hAnsi="Malgun Gothic" w:cs="Malgun Gothic" w:eastAsia="Malgun Gothic"/>
+                <w:b w:val="0"/>
+                <w:i w:val="0"/>
+                <w:sz w:val="20"/>
+              </w:rPr>
+              <w:t>In der Nacht davor는 그 전날 밤이라는 표현입니다.</w:t>
+            </w:r>
+          </w:p>
+        </w:tc>
+      </w:tr>
+      <w:tr>
+        <w:tc>
+          <w:tcPr>
+            <w:tcW w:type="dxa" w:w="1500"/>
+            <w:tcBorders>
+              <w:top w:val="single" w:color="BFBFBF" w:sz="4"/>
+              <w:left w:val="single" w:color="BFBFBF" w:sz="4"/>
+              <w:bottom w:val="single" w:color="BFBFBF" w:sz="4"/>
+              <w:right w:val="single" w:color="BFBFBF" w:sz="4"/>
+            </w:tcBorders>
+            <w:shd w:fill="DEEAF6" w:color="auto" w:val="clear"/>
+          </w:tcPr>
+          <w:p>
+            <w:r>
+              <w:rPr>
+                <w:rFonts w:ascii="Malgun Gothic" w:hAnsi="Malgun Gothic" w:cs="Malgun Gothic" w:eastAsia="Malgun Gothic"/>
+                <w:b/>
+                <w:i w:val="0"/>
+                <w:color w:val="1F3864"/>
+                <w:sz w:val="20"/>
+              </w:rPr>
+              <w:t>시제</w:t>
+            </w:r>
+          </w:p>
+        </w:tc>
+        <w:tc>
+          <w:tcPr>
+            <w:tcW w:type="dxa" w:w="8138"/>
+            <w:tcBorders>
+              <w:top w:val="single" w:color="BFBFBF" w:sz="4"/>
+              <w:left w:val="single" w:color="BFBFBF" w:sz="4"/>
+              <w:bottom w:val="single" w:color="BFBFBF" w:sz="4"/>
+              <w:right w:val="single" w:color="BFBFBF" w:sz="4"/>
+            </w:tcBorders>
+          </w:tcPr>
+          <w:p>
+            <w:pPr>
+              <w:spacing w:after="40"/>
+            </w:pPr>
+            <w:r>
+              <w:rPr>
+                <w:rFonts w:ascii="Malgun Gothic" w:hAnsi="Malgun Gothic" w:cs="Malgun Gothic" w:eastAsia="Malgun Gothic"/>
+                <w:b w:val="0"/>
+                <w:i w:val="0"/>
+                <w:sz w:val="20"/>
+              </w:rPr>
+              <w:t>habe ... geschlafen은 현재완료이고 träumte, war, hinaufstieg는 과거형입니다.</w:t>
+            </w:r>
+          </w:p>
+        </w:tc>
+      </w:tr>
+    </w:tbl>
+    <w:p>
+      <w:pPr>
+        <w:spacing w:after="0"/>
+      </w:pPr>
+    </w:p>
+    <w:p>
+      <w:pPr>
+        <w:keepNext/>
+        <w:spacing w:before="160"/>
+      </w:pPr>
+      <w:r>
+        <w:rPr>
+          <w:rFonts w:ascii="Arial" w:hAnsi="Arial" w:cs="Arial" w:eastAsia="Malgun Gothic"/>
+          <w:b/>
+          <w:i w:val="0"/>
+          <w:sz w:val="22"/>
+        </w:rPr>
+        <w:t>2. Jonas: Ich habe den Morgen mit Liegestützen und starkem Kaffee begonnen, weil mein Körper sich an die Nacht erinnerte. Dann kam Sophies Anruf.</w:t>
+      </w:r>
+    </w:p>
+    <w:p>
+      <w:pPr>
+        <w:keepNext/>
+        <w:ind w:left="340"/>
+      </w:pPr>
+      <w:r>
+        <w:rPr>
+          <w:rFonts w:ascii="Malgun Gothic" w:hAnsi="Malgun Gothic" w:cs="Malgun Gothic" w:eastAsia="Malgun Gothic"/>
+          <w:b w:val="0"/>
+          <w:i/>
+          <w:color w:val="404040"/>
+          <w:sz w:val="20"/>
+        </w:rPr>
+        <w:t>팔굽혀펴기와 진한 커피로 아침을 시작했다. 몸이 밤을 기억하고 있어서였다. 그때 소피의 전화가 왔다.</w:t>
+      </w:r>
+    </w:p>
+    <w:tbl>
+      <w:tblPr>
+        <w:tblW w:type="auto" w:w="0"/>
+        <w:tblLayout w:type="fixed"/>
+        <w:tblLook w:firstColumn="1" w:firstRow="1" w:lastColumn="0" w:lastRow="0" w:noHBand="0" w:noVBand="1" w:val="04A0"/>
+      </w:tblPr>
+      <w:tblGrid>
+        <w:gridCol w:w="4819"/>
+        <w:gridCol w:w="4819"/>
+      </w:tblGrid>
+      <w:tr>
+        <w:tc>
+          <w:tcPr>
+            <w:tcW w:type="dxa" w:w="1500"/>
+            <w:tcBorders>
+              <w:top w:val="single" w:color="BFBFBF" w:sz="4"/>
+              <w:left w:val="single" w:color="BFBFBF" w:sz="4"/>
+              <w:bottom w:val="single" w:color="BFBFBF" w:sz="4"/>
+              <w:right w:val="single" w:color="BFBFBF" w:sz="4"/>
+            </w:tcBorders>
+            <w:shd w:fill="DEEAF6" w:color="auto" w:val="clear"/>
+          </w:tcPr>
+          <w:p>
+            <w:r>
+              <w:rPr>
+                <w:rFonts w:ascii="Malgun Gothic" w:hAnsi="Malgun Gothic" w:cs="Malgun Gothic" w:eastAsia="Malgun Gothic"/>
+                <w:b/>
+                <w:i w:val="0"/>
+                <w:color w:val="1F3864"/>
+                <w:sz w:val="20"/>
+              </w:rPr>
+              <w:t>주요 단어</w:t>
+            </w:r>
+          </w:p>
+        </w:tc>
+        <w:tc>
+          <w:tcPr>
+            <w:tcW w:type="dxa" w:w="8138"/>
+            <w:tcBorders>
+              <w:top w:val="single" w:color="BFBFBF" w:sz="4"/>
+              <w:left w:val="single" w:color="BFBFBF" w:sz="4"/>
+              <w:bottom w:val="single" w:color="BFBFBF" w:sz="4"/>
+              <w:right w:val="single" w:color="BFBFBF" w:sz="4"/>
+            </w:tcBorders>
+          </w:tcPr>
+          <w:p>
+            <w:pPr>
+              <w:spacing w:after="40"/>
+            </w:pPr>
+            <w:r>
+              <w:rPr>
+                <w:rFonts w:ascii="Arial" w:hAnsi="Arial" w:cs="Arial" w:eastAsia="Malgun Gothic"/>
+                <w:b/>
+                <w:i w:val="0"/>
+                <w:sz w:val="20"/>
+              </w:rPr>
+              <w:t>der Liegestütz, -e</w:t>
+            </w:r>
+            <w:r>
+              <w:rPr>
+                <w:rFonts w:ascii="Malgun Gothic" w:hAnsi="Malgun Gothic" w:cs="Malgun Gothic" w:eastAsia="Malgun Gothic"/>
+                <w:b w:val="0"/>
+                <w:i w:val="0"/>
+                <w:sz w:val="20"/>
+              </w:rPr>
+              <w:t xml:space="preserve">  —  팔굽혀펴기</w:t>
+            </w:r>
+          </w:p>
+          <w:p>
+            <w:pPr>
+              <w:spacing w:after="40"/>
+            </w:pPr>
+            <w:r>
+              <w:rPr>
+                <w:rFonts w:ascii="Arial" w:hAnsi="Arial" w:cs="Arial" w:eastAsia="Malgun Gothic"/>
+                <w:b/>
+                <w:i w:val="0"/>
+                <w:sz w:val="20"/>
+              </w:rPr>
+              <w:t>beginnen</w:t>
+            </w:r>
+            <w:r>
+              <w:rPr>
+                <w:rFonts w:ascii="Malgun Gothic" w:hAnsi="Malgun Gothic" w:cs="Malgun Gothic" w:eastAsia="Malgun Gothic"/>
+                <w:b w:val="0"/>
+                <w:i w:val="0"/>
+                <w:sz w:val="20"/>
+              </w:rPr>
+              <w:t xml:space="preserve">  —  시작하다</w:t>
+            </w:r>
+          </w:p>
+          <w:p>
+            <w:pPr>
+              <w:spacing w:after="40"/>
+            </w:pPr>
+            <w:r>
+              <w:rPr>
+                <w:rFonts w:ascii="Arial" w:hAnsi="Arial" w:cs="Arial" w:eastAsia="Malgun Gothic"/>
+                <w:b/>
+                <w:i w:val="0"/>
+                <w:sz w:val="20"/>
+              </w:rPr>
+              <w:t>sich erinnern</w:t>
+            </w:r>
+            <w:r>
+              <w:rPr>
+                <w:rFonts w:ascii="Malgun Gothic" w:hAnsi="Malgun Gothic" w:cs="Malgun Gothic" w:eastAsia="Malgun Gothic"/>
+                <w:b w:val="0"/>
+                <w:i w:val="0"/>
+                <w:sz w:val="20"/>
+              </w:rPr>
+              <w:t xml:space="preserve">  —  기억하다</w:t>
+            </w:r>
+          </w:p>
+        </w:tc>
+      </w:tr>
+      <w:tr>
+        <w:tc>
+          <w:tcPr>
+            <w:tcW w:type="dxa" w:w="1500"/>
+            <w:tcBorders>
+              <w:top w:val="single" w:color="BFBFBF" w:sz="4"/>
+              <w:left w:val="single" w:color="BFBFBF" w:sz="4"/>
+              <w:bottom w:val="single" w:color="BFBFBF" w:sz="4"/>
+              <w:right w:val="single" w:color="BFBFBF" w:sz="4"/>
+            </w:tcBorders>
+            <w:shd w:fill="DEEAF6" w:color="auto" w:val="clear"/>
+          </w:tcPr>
+          <w:p>
+            <w:r>
+              <w:rPr>
+                <w:rFonts w:ascii="Malgun Gothic" w:hAnsi="Malgun Gothic" w:cs="Malgun Gothic" w:eastAsia="Malgun Gothic"/>
+                <w:b/>
+                <w:i w:val="0"/>
+                <w:color w:val="1F3864"/>
+                <w:sz w:val="20"/>
+              </w:rPr>
+              <w:t>문법</w:t>
+            </w:r>
+          </w:p>
+        </w:tc>
+        <w:tc>
+          <w:tcPr>
+            <w:tcW w:type="dxa" w:w="8138"/>
+            <w:tcBorders>
+              <w:top w:val="single" w:color="BFBFBF" w:sz="4"/>
+              <w:left w:val="single" w:color="BFBFBF" w:sz="4"/>
+              <w:bottom w:val="single" w:color="BFBFBF" w:sz="4"/>
+              <w:right w:val="single" w:color="BFBFBF" w:sz="4"/>
+            </w:tcBorders>
+          </w:tcPr>
+          <w:p>
+            <w:pPr>
+              <w:spacing w:after="40"/>
+            </w:pPr>
+            <w:r>
+              <w:rPr>
+                <w:rFonts w:ascii="Malgun Gothic" w:hAnsi="Malgun Gothic" w:cs="Malgun Gothic" w:eastAsia="Malgun Gothic"/>
+                <w:b w:val="0"/>
+                <w:i w:val="0"/>
+                <w:sz w:val="20"/>
+              </w:rPr>
+              <w:t>weil mein Körper sich an die Nacht erinnerte에서 weil절의 과거형 erinnerte가 끝에 옵니다. Dann kam Sophies Anruf에서 kam은 kommen의 과거형입니다.</w:t>
+            </w:r>
+          </w:p>
+        </w:tc>
+      </w:tr>
+      <w:tr>
+        <w:tc>
+          <w:tcPr>
+            <w:tcW w:type="dxa" w:w="1500"/>
+            <w:tcBorders>
+              <w:top w:val="single" w:color="BFBFBF" w:sz="4"/>
+              <w:left w:val="single" w:color="BFBFBF" w:sz="4"/>
+              <w:bottom w:val="single" w:color="BFBFBF" w:sz="4"/>
+              <w:right w:val="single" w:color="BFBFBF" w:sz="4"/>
+            </w:tcBorders>
+            <w:shd w:fill="DEEAF6" w:color="auto" w:val="clear"/>
+          </w:tcPr>
+          <w:p>
+            <w:r>
+              <w:rPr>
+                <w:rFonts w:ascii="Malgun Gothic" w:hAnsi="Malgun Gothic" w:cs="Malgun Gothic" w:eastAsia="Malgun Gothic"/>
+                <w:b/>
+                <w:i w:val="0"/>
+                <w:color w:val="1F3864"/>
+                <w:sz w:val="20"/>
+              </w:rPr>
+              <w:t>표현</w:t>
+            </w:r>
+          </w:p>
+        </w:tc>
+        <w:tc>
+          <w:tcPr>
+            <w:tcW w:type="dxa" w:w="8138"/>
+            <w:tcBorders>
+              <w:top w:val="single" w:color="BFBFBF" w:sz="4"/>
+              <w:left w:val="single" w:color="BFBFBF" w:sz="4"/>
+              <w:bottom w:val="single" w:color="BFBFBF" w:sz="4"/>
+              <w:right w:val="single" w:color="BFBFBF" w:sz="4"/>
+            </w:tcBorders>
+          </w:tcPr>
+          <w:p>
+            <w:pPr>
+              <w:spacing w:after="40"/>
+            </w:pPr>
+            <w:r>
+              <w:rPr>
+                <w:rFonts w:ascii="Malgun Gothic" w:hAnsi="Malgun Gothic" w:cs="Malgun Gothic" w:eastAsia="Malgun Gothic"/>
+                <w:b w:val="0"/>
+                <w:i w:val="0"/>
+                <w:sz w:val="20"/>
+              </w:rPr>
+              <w:t>mit Liegestützen und starkem Kaffee는 mit + 3격입니다.</w:t>
+            </w:r>
+          </w:p>
+        </w:tc>
+      </w:tr>
+      <w:tr>
+        <w:tc>
+          <w:tcPr>
+            <w:tcW w:type="dxa" w:w="1500"/>
+            <w:tcBorders>
+              <w:top w:val="single" w:color="BFBFBF" w:sz="4"/>
+              <w:left w:val="single" w:color="BFBFBF" w:sz="4"/>
+              <w:bottom w:val="single" w:color="BFBFBF" w:sz="4"/>
+              <w:right w:val="single" w:color="BFBFBF" w:sz="4"/>
+            </w:tcBorders>
+            <w:shd w:fill="DEEAF6" w:color="auto" w:val="clear"/>
+          </w:tcPr>
+          <w:p>
+            <w:r>
+              <w:rPr>
+                <w:rFonts w:ascii="Malgun Gothic" w:hAnsi="Malgun Gothic" w:cs="Malgun Gothic" w:eastAsia="Malgun Gothic"/>
+                <w:b/>
+                <w:i w:val="0"/>
+                <w:color w:val="1F3864"/>
+                <w:sz w:val="20"/>
+              </w:rPr>
+              <w:t>시제</w:t>
+            </w:r>
+          </w:p>
+        </w:tc>
+        <w:tc>
+          <w:tcPr>
+            <w:tcW w:type="dxa" w:w="8138"/>
+            <w:tcBorders>
+              <w:top w:val="single" w:color="BFBFBF" w:sz="4"/>
+              <w:left w:val="single" w:color="BFBFBF" w:sz="4"/>
+              <w:bottom w:val="single" w:color="BFBFBF" w:sz="4"/>
+              <w:right w:val="single" w:color="BFBFBF" w:sz="4"/>
+            </w:tcBorders>
+          </w:tcPr>
+          <w:p>
+            <w:pPr>
+              <w:spacing w:after="40"/>
+            </w:pPr>
+            <w:r>
+              <w:rPr>
+                <w:rFonts w:ascii="Malgun Gothic" w:hAnsi="Malgun Gothic" w:cs="Malgun Gothic" w:eastAsia="Malgun Gothic"/>
+                <w:b w:val="0"/>
+                <w:i w:val="0"/>
+                <w:sz w:val="20"/>
+              </w:rPr>
+              <w:t>habe ... begonnen은 현재완료이고 erinnerte, kam은 과거형입니다.</w:t>
+            </w:r>
+          </w:p>
+        </w:tc>
+      </w:tr>
+    </w:tbl>
+    <w:p>
+      <w:pPr>
+        <w:spacing w:after="0"/>
+      </w:pPr>
+    </w:p>
+    <w:p>
+      <w:pPr>
+        <w:keepNext/>
+        <w:spacing w:before="160"/>
+      </w:pPr>
+      <w:r>
+        <w:rPr>
+          <w:rFonts w:ascii="Arial" w:hAnsi="Arial" w:cs="Arial" w:eastAsia="Malgun Gothic"/>
+          <w:b/>
+          <w:i w:val="0"/>
+          <w:sz w:val="22"/>
+        </w:rPr>
+        <w:t>3. Jonas: Dienstagmorgen, kurz vor sieben. Mein Handy vibriert so heftig, dass es fast vom Nachttisch fällt. Sophie.</w:t>
       </w:r>
     </w:p>
     <w:p>
@@ -347,7 +959,7 @@
           <w:i w:val="0"/>
           <w:sz w:val="22"/>
         </w:rPr>
-        <w:t>2. Sophie: Jonas, bist du wach? Schalt den Fernseher ein, rbb, sofort. Die Polizei steht vor Roths Kanzlei.</w:t>
+        <w:t>4. Sophie: Jonas, bist du wach? Schalt den Fernseher ein, rbb, sofort. Die Polizei steht vor Roths Kanzlei.</w:t>
       </w:r>
     </w:p>
     <w:p>
@@ -653,7 +1265,7 @@
           <w:i w:val="0"/>
           <w:sz w:val="22"/>
         </w:rPr>
-        <w:t>3. Jonas: Ich stolpere ins Wohnzimmer und drücke auf die Fernbedienung. Auf dem Bildschirm steht eine Reporterin vor der bekannten Glasfassade. Dahinter laufen Beamte in Westen hin und her.</w:t>
+        <w:t>5. Jonas: Ich stolpere ins Wohnzimmer und drücke auf die Fernbedienung. Auf dem Bildschirm steht eine Reporterin vor der bekannten Glasfassade. Dahinter laufen Beamte in Westen hin und her.</w:t>
       </w:r>
     </w:p>
     <w:p>
@@ -959,7 +1571,7 @@
           <w:i w:val="0"/>
           <w:sz w:val="22"/>
         </w:rPr>
-        <w:t>4. Reporterin: Seit sechs Uhr dreißig durchsuchen Ermittler der Staatsanwaltschaft die Räume einer der größten Berliner Kanzleien. Der Vorwurf: Beweismittelunterdrückung im Zusammenhang mit einem Bauunfall.</w:t>
+        <w:t>6. Reporterin: Seit sechs Uhr dreißig durchsuchen Ermittler der Staatsanwaltschaft die Räume einer der größten Berliner Kanzleien. Der Vorwurf: Beweismittelunterdrückung im Zusammenhang mit einem Bauunfall.</w:t>
       </w:r>
     </w:p>
     <w:p>
@@ -1265,7 +1877,7 @@
           <w:i w:val="0"/>
           <w:sz w:val="22"/>
         </w:rPr>
-        <w:t>5. Jonas: Ich sinke aufs Sofa. Mein Körper hat sich die ganze Woche auf diesen Moment vorbereitet, und trotzdem fühle ich mich wie nach einem Schlag auf den Hinterkopf.</w:t>
+        <w:t>7. Jonas: Ich sinke aufs Sofa. Mein Körper hat sich die ganze Woche auf diesen Moment vorbereitet, und trotzdem fühle ich mich wie nach einem Schlag auf den Hinterkopf.</w:t>
       </w:r>
     </w:p>
     <w:p>
@@ -1571,7 +2183,7 @@
           <w:i w:val="0"/>
           <w:sz w:val="22"/>
         </w:rPr>
-        <w:t>6. Sophie: Lena hat mir gerade geschrieben. Sie sagt, die Beamten haben um Viertel vor sieben geklingelt. Roth war schon da, in Jeans, ohne Krawatte. Er sah aus wie ein anderer Mensch.</w:t>
+        <w:t>8. Sophie: Lena hat mir gerade geschrieben. Sie sagt, die Beamten haben um Viertel vor sieben geklingelt. Roth war schon da, in Jeans, ohne Krawatte. Er sah aus wie ein anderer Mensch.</w:t>
       </w:r>
     </w:p>
     <w:p>
@@ -1877,7 +2489,7 @@
           <w:i w:val="0"/>
           <w:sz w:val="22"/>
         </w:rPr>
-        <w:t>7. Jonas: Wie reagiert er? Hat er Widerstand geleistet?</w:t>
+        <w:t>9. Jonas: Wie reagiert er? Hat er Widerstand geleistet?</w:t>
       </w:r>
     </w:p>
     <w:p>
@@ -2183,7 +2795,7 @@
           <w:i w:val="0"/>
           <w:sz w:val="22"/>
         </w:rPr>
-        <w:t>8. Sophie: Nein. Er hat gesagt: „Meine Herren, ich kooperiere vollständig. Die Akten stehen im Keller, Regal vierzehn." Er hat sogar die Schlüssel mitgebracht.</w:t>
+        <w:t>10. Sophie: Nein. Er hat gesagt: „Meine Herren, ich kooperiere vollständig. Die Akten stehen im Keller, Regal vierzehn." Er hat sogar die Schlüssel mitgebracht.</w:t>
       </w:r>
     </w:p>
     <w:p>
@@ -2489,7 +3101,7 @@
           <w:i w:val="0"/>
           <w:sz w:val="22"/>
         </w:rPr>
-        <w:t>9. Jonas: Er hat die Akten nicht vernichtet? Obwohl er es angewiesen hatte?</w:t>
+        <w:t>11. Jonas: Er hat die Akten nicht vernichtet? Obwohl er es angewiesen hatte?</w:t>
       </w:r>
     </w:p>
     <w:p>
@@ -2795,7 +3407,7 @@
           <w:i w:val="0"/>
           <w:sz w:val="22"/>
         </w:rPr>
-        <w:t>10. Sophie: Das ist das Merkwürdige. Entweder hatte er keine Zeit mehr, oder er hat gemerkt, dass es zu spät war. Vielleicht hat er sogar alles vorbereitet, um als Kooperationspartner dazustehen.</w:t>
+        <w:t>12. Sophie: Das ist das Merkwürdige. Entweder hatte er keine Zeit mehr, oder er hat gemerkt, dass es zu spät war. Vielleicht hat er sogar alles vorbereitet, um als Kooperationspartner dazustehen.</w:t>
       </w:r>
     </w:p>
     <w:p>
@@ -3101,7 +3713,7 @@
           <w:i w:val="0"/>
           <w:sz w:val="22"/>
         </w:rPr>
-        <w:t>11. Jonas: Das passt zu ihm. Wer Jahre lang Taktiken geplant hat, verlässt das Spielfeld nicht ohne einen letzten Zug.</w:t>
+        <w:t>13. Jonas: Das passt zu ihm. Wer Jahre lang Taktiken geplant hat, verlässt das Spielfeld nicht ohne einen letzten Zug.</w:t>
       </w:r>
     </w:p>
     <w:p>
@@ -3407,7 +4019,7 @@
           <w:i w:val="0"/>
           <w:sz w:val="22"/>
         </w:rPr>
-        <w:t>12. Hanna: Keller, ich bin auf dem Weg zur Staatsanwaltschaft. Die Beschlagnahme betrifft auch Akten, die mit unserem Verfahren zu tun haben. Wir müssen Sicherungskopien beantragen.</w:t>
+        <w:t>14. Hanna: Keller, ich bin auf dem Weg zur Staatsanwaltschaft. Die Beschlagnahme betrifft auch Akten, die mit unserem Verfahren zu tun haben. Wir müssen Sicherungskopien beantragen.</w:t>
       </w:r>
     </w:p>
     <w:p>
@@ -3713,7 +4325,7 @@
           <w:i w:val="0"/>
           <w:sz w:val="22"/>
         </w:rPr>
-        <w:t>13. Jonas: Ich komme mit. Ich ziehe mir nur schnell etwas an. Treffen wir uns vor dem Gebäude?</w:t>
+        <w:t>15. Jonas: Ich komme mit. Ich ziehe mir nur schnell etwas an. Treffen wir uns vor dem Gebäude?</w:t>
       </w:r>
     </w:p>
     <w:p>
@@ -4019,7 +4631,7 @@
           <w:i w:val="0"/>
           <w:sz w:val="22"/>
         </w:rPr>
-        <w:t>14. Hanna: Nein, Sie bleiben, wo Sie sind. Als Mitbeschuldigter dürfen Sie keinen Zugang zu laufenden Ermittlungen haben. Das gilt auch für die Kammer. Haben Sie die Stellungnahme abgeschickt?</w:t>
+        <w:t>16. Hanna: Nein, Sie bleiben, wo Sie sind. Als Mitbeschuldigter dürfen Sie keinen Zugang zu laufenden Ermittlungen haben. Das gilt auch für die Kammer. Haben Sie die Stellungnahme abgeschickt?</w:t>
       </w:r>
     </w:p>
     <w:p>
@@ -4325,7 +4937,7 @@
           <w:i w:val="0"/>
           <w:sz w:val="22"/>
         </w:rPr>
-        <w:t>15. Jonas: Ja, gestern. Sie lag in meinem Briefkasten, bevor ich überhaupt wusste, dass heute etwas passiert.</w:t>
+        <w:t>17. Jonas: Ja, gestern. Sie lag in meinem Briefkasten, bevor ich überhaupt wusste, dass heute etwas passiert.</w:t>
       </w:r>
     </w:p>
     <w:p>
@@ -4631,7 +5243,7 @@
           <w:i w:val="0"/>
           <w:sz w:val="22"/>
         </w:rPr>
-        <w:t>16. Hanna: Gut. Dann bleibt Ihnen heute nur eines: ruhig zu bleiben. Gehen Sie arbeiten, liefern Sie Pizza, atmen Sie. Das ist ein Auftrag.</w:t>
+        <w:t>18. Hanna: Gut. Dann bleibt Ihnen heute nur eines: ruhig zu bleiben. Gehen Sie arbeiten, liefern Sie Pizza, atmen Sie. Das ist ein Auftrag.</w:t>
       </w:r>
     </w:p>
     <w:p>
@@ -4937,7 +5549,7 @@
           <w:i w:val="0"/>
           <w:sz w:val="22"/>
         </w:rPr>
-        <w:t>17. Jonas: Ich folge ihrem Rat und stelle mich um acht ins Depot. Die Stimmung dort ist merkwürdig: Alle haben die Nachrichten gesehen, aber keiner spricht davon.</w:t>
+        <w:t>19. Jonas: Ich folge ihrem Rat und stelle mich um acht ins Depot. Die Stimmung dort ist merkwürdig: Alle haben die Nachrichten gesehen, aber keiner spricht davon.</w:t>
       </w:r>
     </w:p>
     <w:p>
@@ -5243,7 +5855,7 @@
           <w:i w:val="0"/>
           <w:sz w:val="22"/>
         </w:rPr>
-        <w:t>18. Aylin: Hast du es gesehen? Roths Kanzlei! Das ist doch der Mann, von dem die Rede war. Das ist ja wahnsinnig!</w:t>
+        <w:t>20. Aylin: Hast du es gesehen? Roths Kanzlei! Das ist doch der Mann, von dem die Rede war. Das ist ja wahnsinnig!</w:t>
       </w:r>
     </w:p>
     <w:p>
@@ -5549,7 +6161,7 @@
           <w:i w:val="0"/>
           <w:sz w:val="22"/>
         </w:rPr>
-        <w:t>19. Jonas: Ich habe es gesehen. Aber wir wissen noch nichts. Heute ist nur ein Tag, an dem Menschen in einer Kanzlei Kisten packen. Die Wahrheit kommt später.</w:t>
+        <w:t>21. Jonas: Ich habe es gesehen. Aber wir wissen noch nichts. Heute ist nur ein Tag, an dem Menschen in einer Kanzlei Kisten packen. Die Wahrheit kommt später.</w:t>
       </w:r>
     </w:p>
     <w:p>
@@ -5855,7 +6467,7 @@
           <w:i w:val="0"/>
           <w:sz w:val="22"/>
         </w:rPr>
-        <w:t>20. Karim: Warum bist du so ruhig? Du müsstest doch am glücklichsten sein. Dein Feind liegt am Boden.</w:t>
+        <w:t>22. Karim: Warum bist du so ruhig? Du müsstest doch am glücklichsten sein. Dein Feind liegt am Boden.</w:t>
       </w:r>
     </w:p>
     <w:p>
@@ -6161,7 +6773,7 @@
           <w:i w:val="0"/>
           <w:sz w:val="22"/>
         </w:rPr>
-        <w:t>21. Jonas: Weil ich nicht glaube, dass ein Feind am Boden das Ziel ist. Das Ziel ist ein System, in dem niemand mehr auf den Boden gedrückt wird.</w:t>
+        <w:t>23. Jonas: Weil ich nicht glaube, dass ein Feind am Boden das Ziel ist. Das Ziel ist ein System, in dem niemand mehr auf den Boden gedrückt wird.</w:t>
       </w:r>
     </w:p>
     <w:p>
@@ -6467,7 +7079,7 @@
           <w:i w:val="0"/>
           <w:sz w:val="22"/>
         </w:rPr>
-        <w:t>22. Karim: Das klingt schön. Aber heute Abend feiere ich trotzdem still ein bisschen. Ein Mann, der mich zweimal um meine Papiere hat zittern lassen, hat sich selbst verfangen.</w:t>
+        <w:t>24. Karim: Das klingt schön. Aber heute Abend feiere ich trotzdem still ein bisschen. Ein Mann, der mich zweimal um meine Papiere hat zittern lassen, hat sich selbst verfangen.</w:t>
       </w:r>
     </w:p>
     <w:p>
@@ -6773,7 +7385,7 @@
           <w:i w:val="0"/>
           <w:sz w:val="22"/>
         </w:rPr>
-        <w:t>23. Jonas: Dann feier zu Hause, nicht im Depot. Und wenn jemand dich fragt: „Kein Kommentar." Das ist heute die beste Antwort.</w:t>
+        <w:t>25. Jonas: Dann feier zu Hause, nicht im Depot. Und wenn jemand dich fragt: „Kein Kommentar." Das ist heute die beste Antwort.</w:t>
       </w:r>
     </w:p>
     <w:p>
@@ -7079,7 +7691,2761 @@
           <w:i w:val="0"/>
           <w:sz w:val="22"/>
         </w:rPr>
-        <w:t>24. Jonas: Am Mittag erreicht mich eine kurze Nachricht von Dietrich: „Sie haben heute Nacht bei mir geklingelt. Kein Durchsuchungsbeschluss, nur zwei freundliche Beamte, die mir eine Zeugenladung brachten. Claudia hat Kaffee gekocht."</w:t>
+        <w:t>26. Hanna: Am frühen Nachmittag erreichen mich die ersten Informationen. Die Staatsanwaltschaft hat achtzehn Kisten mit Akten sichergestellt, davon vier aus dem Keller.</w:t>
+      </w:r>
+    </w:p>
+    <w:p>
+      <w:pPr>
+        <w:keepNext/>
+        <w:ind w:left="340"/>
+      </w:pPr>
+      <w:r>
+        <w:rPr>
+          <w:rFonts w:ascii="Malgun Gothic" w:hAnsi="Malgun Gothic" w:cs="Malgun Gothic" w:eastAsia="Malgun Gothic"/>
+          <w:b w:val="0"/>
+          <w:i/>
+          <w:color w:val="404040"/>
+          <w:sz w:val="20"/>
+        </w:rPr>
+        <w:t>이른 오후에 첫 정보가 들어왔어요. 검찰이 서류 상자 열여덟 개를 압수했고 그중 네 개가 지하실 것입니다.</w:t>
+      </w:r>
+    </w:p>
+    <w:tbl>
+      <w:tblPr>
+        <w:tblW w:type="auto" w:w="0"/>
+        <w:tblLayout w:type="fixed"/>
+        <w:tblLook w:firstColumn="1" w:firstRow="1" w:lastColumn="0" w:lastRow="0" w:noHBand="0" w:noVBand="1" w:val="04A0"/>
+      </w:tblPr>
+      <w:tblGrid>
+        <w:gridCol w:w="4819"/>
+        <w:gridCol w:w="4819"/>
+      </w:tblGrid>
+      <w:tr>
+        <w:tc>
+          <w:tcPr>
+            <w:tcW w:type="dxa" w:w="1500"/>
+            <w:tcBorders>
+              <w:top w:val="single" w:color="BFBFBF" w:sz="4"/>
+              <w:left w:val="single" w:color="BFBFBF" w:sz="4"/>
+              <w:bottom w:val="single" w:color="BFBFBF" w:sz="4"/>
+              <w:right w:val="single" w:color="BFBFBF" w:sz="4"/>
+            </w:tcBorders>
+            <w:shd w:fill="DEEAF6" w:color="auto" w:val="clear"/>
+          </w:tcPr>
+          <w:p>
+            <w:r>
+              <w:rPr>
+                <w:rFonts w:ascii="Malgun Gothic" w:hAnsi="Malgun Gothic" w:cs="Malgun Gothic" w:eastAsia="Malgun Gothic"/>
+                <w:b/>
+                <w:i w:val="0"/>
+                <w:color w:val="1F3864"/>
+                <w:sz w:val="20"/>
+              </w:rPr>
+              <w:t>주요 단어</w:t>
+            </w:r>
+          </w:p>
+        </w:tc>
+        <w:tc>
+          <w:tcPr>
+            <w:tcW w:type="dxa" w:w="8138"/>
+            <w:tcBorders>
+              <w:top w:val="single" w:color="BFBFBF" w:sz="4"/>
+              <w:left w:val="single" w:color="BFBFBF" w:sz="4"/>
+              <w:bottom w:val="single" w:color="BFBFBF" w:sz="4"/>
+              <w:right w:val="single" w:color="BFBFBF" w:sz="4"/>
+            </w:tcBorders>
+          </w:tcPr>
+          <w:p>
+            <w:pPr>
+              <w:spacing w:after="40"/>
+            </w:pPr>
+            <w:r>
+              <w:rPr>
+                <w:rFonts w:ascii="Arial" w:hAnsi="Arial" w:cs="Arial" w:eastAsia="Malgun Gothic"/>
+                <w:b/>
+                <w:i w:val="0"/>
+                <w:sz w:val="20"/>
+              </w:rPr>
+              <w:t>sicherstellen</w:t>
+            </w:r>
+            <w:r>
+              <w:rPr>
+                <w:rFonts w:ascii="Malgun Gothic" w:hAnsi="Malgun Gothic" w:cs="Malgun Gothic" w:eastAsia="Malgun Gothic"/>
+                <w:b w:val="0"/>
+                <w:i w:val="0"/>
+                <w:sz w:val="20"/>
+              </w:rPr>
+              <w:t xml:space="preserve">  —  압수하다</w:t>
+            </w:r>
+          </w:p>
+          <w:p>
+            <w:pPr>
+              <w:spacing w:after="40"/>
+            </w:pPr>
+            <w:r>
+              <w:rPr>
+                <w:rFonts w:ascii="Arial" w:hAnsi="Arial" w:cs="Arial" w:eastAsia="Malgun Gothic"/>
+                <w:b/>
+                <w:i w:val="0"/>
+                <w:sz w:val="20"/>
+              </w:rPr>
+              <w:t>die Kiste, -n</w:t>
+            </w:r>
+            <w:r>
+              <w:rPr>
+                <w:rFonts w:ascii="Malgun Gothic" w:hAnsi="Malgun Gothic" w:cs="Malgun Gothic" w:eastAsia="Malgun Gothic"/>
+                <w:b w:val="0"/>
+                <w:i w:val="0"/>
+                <w:sz w:val="20"/>
+              </w:rPr>
+              <w:t xml:space="preserve">  —  상자</w:t>
+            </w:r>
+          </w:p>
+          <w:p>
+            <w:pPr>
+              <w:spacing w:after="40"/>
+            </w:pPr>
+            <w:r>
+              <w:rPr>
+                <w:rFonts w:ascii="Arial" w:hAnsi="Arial" w:cs="Arial" w:eastAsia="Malgun Gothic"/>
+                <w:b/>
+                <w:i w:val="0"/>
+                <w:sz w:val="20"/>
+              </w:rPr>
+              <w:t>der Keller, -</w:t>
+            </w:r>
+            <w:r>
+              <w:rPr>
+                <w:rFonts w:ascii="Malgun Gothic" w:hAnsi="Malgun Gothic" w:cs="Malgun Gothic" w:eastAsia="Malgun Gothic"/>
+                <w:b w:val="0"/>
+                <w:i w:val="0"/>
+                <w:sz w:val="20"/>
+              </w:rPr>
+              <w:t xml:space="preserve">  —  지하실</w:t>
+            </w:r>
+          </w:p>
+        </w:tc>
+      </w:tr>
+      <w:tr>
+        <w:tc>
+          <w:tcPr>
+            <w:tcW w:type="dxa" w:w="1500"/>
+            <w:tcBorders>
+              <w:top w:val="single" w:color="BFBFBF" w:sz="4"/>
+              <w:left w:val="single" w:color="BFBFBF" w:sz="4"/>
+              <w:bottom w:val="single" w:color="BFBFBF" w:sz="4"/>
+              <w:right w:val="single" w:color="BFBFBF" w:sz="4"/>
+            </w:tcBorders>
+            <w:shd w:fill="DEEAF6" w:color="auto" w:val="clear"/>
+          </w:tcPr>
+          <w:p>
+            <w:r>
+              <w:rPr>
+                <w:rFonts w:ascii="Malgun Gothic" w:hAnsi="Malgun Gothic" w:cs="Malgun Gothic" w:eastAsia="Malgun Gothic"/>
+                <w:b/>
+                <w:i w:val="0"/>
+                <w:color w:val="1F3864"/>
+                <w:sz w:val="20"/>
+              </w:rPr>
+              <w:t>문법</w:t>
+            </w:r>
+          </w:p>
+        </w:tc>
+        <w:tc>
+          <w:tcPr>
+            <w:tcW w:type="dxa" w:w="8138"/>
+            <w:tcBorders>
+              <w:top w:val="single" w:color="BFBFBF" w:sz="4"/>
+              <w:left w:val="single" w:color="BFBFBF" w:sz="4"/>
+              <w:bottom w:val="single" w:color="BFBFBF" w:sz="4"/>
+              <w:right w:val="single" w:color="BFBFBF" w:sz="4"/>
+            </w:tcBorders>
+          </w:tcPr>
+          <w:p>
+            <w:pPr>
+              <w:spacing w:after="40"/>
+            </w:pPr>
+            <w:r>
+              <w:rPr>
+                <w:rFonts w:ascii="Malgun Gothic" w:hAnsi="Malgun Gothic" w:cs="Malgun Gothic" w:eastAsia="Malgun Gothic"/>
+                <w:b w:val="0"/>
+                <w:i w:val="0"/>
+                <w:sz w:val="20"/>
+              </w:rPr>
+              <w:t>Die Staatsanwaltschaft hat achtzehn Kisten ... sichergestellt는 분리동사 sicherstellen의 현재완료입니다. davon은 그중에서라는 대명사 부사입니다.</w:t>
+            </w:r>
+          </w:p>
+        </w:tc>
+      </w:tr>
+      <w:tr>
+        <w:tc>
+          <w:tcPr>
+            <w:tcW w:type="dxa" w:w="1500"/>
+            <w:tcBorders>
+              <w:top w:val="single" w:color="BFBFBF" w:sz="4"/>
+              <w:left w:val="single" w:color="BFBFBF" w:sz="4"/>
+              <w:bottom w:val="single" w:color="BFBFBF" w:sz="4"/>
+              <w:right w:val="single" w:color="BFBFBF" w:sz="4"/>
+            </w:tcBorders>
+            <w:shd w:fill="DEEAF6" w:color="auto" w:val="clear"/>
+          </w:tcPr>
+          <w:p>
+            <w:r>
+              <w:rPr>
+                <w:rFonts w:ascii="Malgun Gothic" w:hAnsi="Malgun Gothic" w:cs="Malgun Gothic" w:eastAsia="Malgun Gothic"/>
+                <w:b/>
+                <w:i w:val="0"/>
+                <w:color w:val="1F3864"/>
+                <w:sz w:val="20"/>
+              </w:rPr>
+              <w:t>표현</w:t>
+            </w:r>
+          </w:p>
+        </w:tc>
+        <w:tc>
+          <w:tcPr>
+            <w:tcW w:type="dxa" w:w="8138"/>
+            <w:tcBorders>
+              <w:top w:val="single" w:color="BFBFBF" w:sz="4"/>
+              <w:left w:val="single" w:color="BFBFBF" w:sz="4"/>
+              <w:bottom w:val="single" w:color="BFBFBF" w:sz="4"/>
+              <w:right w:val="single" w:color="BFBFBF" w:sz="4"/>
+            </w:tcBorders>
+          </w:tcPr>
+          <w:p>
+            <w:pPr>
+              <w:spacing w:after="40"/>
+            </w:pPr>
+            <w:r>
+              <w:rPr>
+                <w:rFonts w:ascii="Malgun Gothic" w:hAnsi="Malgun Gothic" w:cs="Malgun Gothic" w:eastAsia="Malgun Gothic"/>
+                <w:b w:val="0"/>
+                <w:i w:val="0"/>
+                <w:sz w:val="20"/>
+              </w:rPr>
+              <w:t>Am frühen Nachmittag은 am + 형용사 + 명사입니다.</w:t>
+            </w:r>
+          </w:p>
+        </w:tc>
+      </w:tr>
+      <w:tr>
+        <w:tc>
+          <w:tcPr>
+            <w:tcW w:type="dxa" w:w="1500"/>
+            <w:tcBorders>
+              <w:top w:val="single" w:color="BFBFBF" w:sz="4"/>
+              <w:left w:val="single" w:color="BFBFBF" w:sz="4"/>
+              <w:bottom w:val="single" w:color="BFBFBF" w:sz="4"/>
+              <w:right w:val="single" w:color="BFBFBF" w:sz="4"/>
+            </w:tcBorders>
+            <w:shd w:fill="DEEAF6" w:color="auto" w:val="clear"/>
+          </w:tcPr>
+          <w:p>
+            <w:r>
+              <w:rPr>
+                <w:rFonts w:ascii="Malgun Gothic" w:hAnsi="Malgun Gothic" w:cs="Malgun Gothic" w:eastAsia="Malgun Gothic"/>
+                <w:b/>
+                <w:i w:val="0"/>
+                <w:color w:val="1F3864"/>
+                <w:sz w:val="20"/>
+              </w:rPr>
+              <w:t>시제</w:t>
+            </w:r>
+          </w:p>
+        </w:tc>
+        <w:tc>
+          <w:tcPr>
+            <w:tcW w:type="dxa" w:w="8138"/>
+            <w:tcBorders>
+              <w:top w:val="single" w:color="BFBFBF" w:sz="4"/>
+              <w:left w:val="single" w:color="BFBFBF" w:sz="4"/>
+              <w:bottom w:val="single" w:color="BFBFBF" w:sz="4"/>
+              <w:right w:val="single" w:color="BFBFBF" w:sz="4"/>
+            </w:tcBorders>
+          </w:tcPr>
+          <w:p>
+            <w:pPr>
+              <w:spacing w:after="40"/>
+            </w:pPr>
+            <w:r>
+              <w:rPr>
+                <w:rFonts w:ascii="Malgun Gothic" w:hAnsi="Malgun Gothic" w:cs="Malgun Gothic" w:eastAsia="Malgun Gothic"/>
+                <w:b w:val="0"/>
+                <w:i w:val="0"/>
+                <w:sz w:val="20"/>
+              </w:rPr>
+              <w:t>erreichen은 현재형이고 hat ... sichergestellt는 현재완료입니다.</w:t>
+            </w:r>
+          </w:p>
+        </w:tc>
+      </w:tr>
+    </w:tbl>
+    <w:p>
+      <w:pPr>
+        <w:spacing w:after="0"/>
+      </w:pPr>
+    </w:p>
+    <w:p>
+      <w:pPr>
+        <w:keepNext/>
+        <w:spacing w:before="160"/>
+      </w:pPr>
+      <w:r>
+        <w:rPr>
+          <w:rFonts w:ascii="Arial" w:hAnsi="Arial" w:cs="Arial" w:eastAsia="Malgun Gothic"/>
+          <w:b/>
+          <w:i w:val="0"/>
+          <w:sz w:val="22"/>
+        </w:rPr>
+        <w:t>27. Jonas: Vier Kisten aus dem Keller. Das sind die Akten, die er hätte vernichten sollen. Hat er sie am Ende doch bewusst dort gelassen?</w:t>
+      </w:r>
+    </w:p>
+    <w:p>
+      <w:pPr>
+        <w:keepNext/>
+        <w:ind w:left="340"/>
+      </w:pPr>
+      <w:r>
+        <w:rPr>
+          <w:rFonts w:ascii="Malgun Gothic" w:hAnsi="Malgun Gothic" w:cs="Malgun Gothic" w:eastAsia="Malgun Gothic"/>
+          <w:b w:val="0"/>
+          <w:i/>
+          <w:color w:val="404040"/>
+          <w:sz w:val="20"/>
+        </w:rPr>
+        <w:t>지하실에서 상자 네 개라니. 그가 파기했어야 할 기록들이다. 결국 일부러 거기 놔뒀을까?</w:t>
+      </w:r>
+    </w:p>
+    <w:tbl>
+      <w:tblPr>
+        <w:tblW w:type="auto" w:w="0"/>
+        <w:tblLayout w:type="fixed"/>
+        <w:tblLook w:firstColumn="1" w:firstRow="1" w:lastColumn="0" w:lastRow="0" w:noHBand="0" w:noVBand="1" w:val="04A0"/>
+      </w:tblPr>
+      <w:tblGrid>
+        <w:gridCol w:w="4819"/>
+        <w:gridCol w:w="4819"/>
+      </w:tblGrid>
+      <w:tr>
+        <w:tc>
+          <w:tcPr>
+            <w:tcW w:type="dxa" w:w="1500"/>
+            <w:tcBorders>
+              <w:top w:val="single" w:color="BFBFBF" w:sz="4"/>
+              <w:left w:val="single" w:color="BFBFBF" w:sz="4"/>
+              <w:bottom w:val="single" w:color="BFBFBF" w:sz="4"/>
+              <w:right w:val="single" w:color="BFBFBF" w:sz="4"/>
+            </w:tcBorders>
+            <w:shd w:fill="DEEAF6" w:color="auto" w:val="clear"/>
+          </w:tcPr>
+          <w:p>
+            <w:r>
+              <w:rPr>
+                <w:rFonts w:ascii="Malgun Gothic" w:hAnsi="Malgun Gothic" w:cs="Malgun Gothic" w:eastAsia="Malgun Gothic"/>
+                <w:b/>
+                <w:i w:val="0"/>
+                <w:color w:val="1F3864"/>
+                <w:sz w:val="20"/>
+              </w:rPr>
+              <w:t>주요 단어</w:t>
+            </w:r>
+          </w:p>
+        </w:tc>
+        <w:tc>
+          <w:tcPr>
+            <w:tcW w:type="dxa" w:w="8138"/>
+            <w:tcBorders>
+              <w:top w:val="single" w:color="BFBFBF" w:sz="4"/>
+              <w:left w:val="single" w:color="BFBFBF" w:sz="4"/>
+              <w:bottom w:val="single" w:color="BFBFBF" w:sz="4"/>
+              <w:right w:val="single" w:color="BFBFBF" w:sz="4"/>
+            </w:tcBorders>
+          </w:tcPr>
+          <w:p>
+            <w:pPr>
+              <w:spacing w:after="40"/>
+            </w:pPr>
+            <w:r>
+              <w:rPr>
+                <w:rFonts w:ascii="Arial" w:hAnsi="Arial" w:cs="Arial" w:eastAsia="Malgun Gothic"/>
+                <w:b/>
+                <w:i w:val="0"/>
+                <w:sz w:val="20"/>
+              </w:rPr>
+              <w:t>vernichten</w:t>
+            </w:r>
+            <w:r>
+              <w:rPr>
+                <w:rFonts w:ascii="Malgun Gothic" w:hAnsi="Malgun Gothic" w:cs="Malgun Gothic" w:eastAsia="Malgun Gothic"/>
+                <w:b w:val="0"/>
+                <w:i w:val="0"/>
+                <w:sz w:val="20"/>
+              </w:rPr>
+              <w:t xml:space="preserve">  —  파기하다</w:t>
+            </w:r>
+          </w:p>
+          <w:p>
+            <w:pPr>
+              <w:spacing w:after="40"/>
+            </w:pPr>
+            <w:r>
+              <w:rPr>
+                <w:rFonts w:ascii="Arial" w:hAnsi="Arial" w:cs="Arial" w:eastAsia="Malgun Gothic"/>
+                <w:b/>
+                <w:i w:val="0"/>
+                <w:sz w:val="20"/>
+              </w:rPr>
+              <w:t>bewusst</w:t>
+            </w:r>
+            <w:r>
+              <w:rPr>
+                <w:rFonts w:ascii="Malgun Gothic" w:hAnsi="Malgun Gothic" w:cs="Malgun Gothic" w:eastAsia="Malgun Gothic"/>
+                <w:b w:val="0"/>
+                <w:i w:val="0"/>
+                <w:sz w:val="20"/>
+              </w:rPr>
+              <w:t xml:space="preserve">  —  의도적으로</w:t>
+            </w:r>
+          </w:p>
+          <w:p>
+            <w:pPr>
+              <w:spacing w:after="40"/>
+            </w:pPr>
+            <w:r>
+              <w:rPr>
+                <w:rFonts w:ascii="Arial" w:hAnsi="Arial" w:cs="Arial" w:eastAsia="Malgun Gothic"/>
+                <w:b/>
+                <w:i w:val="0"/>
+                <w:sz w:val="20"/>
+              </w:rPr>
+              <w:t>lassen</w:t>
+            </w:r>
+            <w:r>
+              <w:rPr>
+                <w:rFonts w:ascii="Malgun Gothic" w:hAnsi="Malgun Gothic" w:cs="Malgun Gothic" w:eastAsia="Malgun Gothic"/>
+                <w:b w:val="0"/>
+                <w:i w:val="0"/>
+                <w:sz w:val="20"/>
+              </w:rPr>
+              <w:t xml:space="preserve">  —  남겨 두다</w:t>
+            </w:r>
+          </w:p>
+        </w:tc>
+      </w:tr>
+      <w:tr>
+        <w:tc>
+          <w:tcPr>
+            <w:tcW w:type="dxa" w:w="1500"/>
+            <w:tcBorders>
+              <w:top w:val="single" w:color="BFBFBF" w:sz="4"/>
+              <w:left w:val="single" w:color="BFBFBF" w:sz="4"/>
+              <w:bottom w:val="single" w:color="BFBFBF" w:sz="4"/>
+              <w:right w:val="single" w:color="BFBFBF" w:sz="4"/>
+            </w:tcBorders>
+            <w:shd w:fill="DEEAF6" w:color="auto" w:val="clear"/>
+          </w:tcPr>
+          <w:p>
+            <w:r>
+              <w:rPr>
+                <w:rFonts w:ascii="Malgun Gothic" w:hAnsi="Malgun Gothic" w:cs="Malgun Gothic" w:eastAsia="Malgun Gothic"/>
+                <w:b/>
+                <w:i w:val="0"/>
+                <w:color w:val="1F3864"/>
+                <w:sz w:val="20"/>
+              </w:rPr>
+              <w:t>문법</w:t>
+            </w:r>
+          </w:p>
+        </w:tc>
+        <w:tc>
+          <w:tcPr>
+            <w:tcW w:type="dxa" w:w="8138"/>
+            <w:tcBorders>
+              <w:top w:val="single" w:color="BFBFBF" w:sz="4"/>
+              <w:left w:val="single" w:color="BFBFBF" w:sz="4"/>
+              <w:bottom w:val="single" w:color="BFBFBF" w:sz="4"/>
+              <w:right w:val="single" w:color="BFBFBF" w:sz="4"/>
+            </w:tcBorders>
+          </w:tcPr>
+          <w:p>
+            <w:pPr>
+              <w:spacing w:after="40"/>
+            </w:pPr>
+            <w:r>
+              <w:rPr>
+                <w:rFonts w:ascii="Malgun Gothic" w:hAnsi="Malgun Gothic" w:cs="Malgun Gothic" w:eastAsia="Malgun Gothic"/>
+                <w:b w:val="0"/>
+                <w:i w:val="0"/>
+                <w:sz w:val="20"/>
+              </w:rPr>
+              <w:t>die er hätte vernichten sollen은 접속법 II 과거로 했어야 했던 일을 나타냅니다. Hat er sie ... doch bewusst dort gelassen?은 현재완료 의문문입니다.</w:t>
+            </w:r>
+          </w:p>
+        </w:tc>
+      </w:tr>
+      <w:tr>
+        <w:tc>
+          <w:tcPr>
+            <w:tcW w:type="dxa" w:w="1500"/>
+            <w:tcBorders>
+              <w:top w:val="single" w:color="BFBFBF" w:sz="4"/>
+              <w:left w:val="single" w:color="BFBFBF" w:sz="4"/>
+              <w:bottom w:val="single" w:color="BFBFBF" w:sz="4"/>
+              <w:right w:val="single" w:color="BFBFBF" w:sz="4"/>
+            </w:tcBorders>
+            <w:shd w:fill="DEEAF6" w:color="auto" w:val="clear"/>
+          </w:tcPr>
+          <w:p>
+            <w:r>
+              <w:rPr>
+                <w:rFonts w:ascii="Malgun Gothic" w:hAnsi="Malgun Gothic" w:cs="Malgun Gothic" w:eastAsia="Malgun Gothic"/>
+                <w:b/>
+                <w:i w:val="0"/>
+                <w:color w:val="1F3864"/>
+                <w:sz w:val="20"/>
+              </w:rPr>
+              <w:t>표현</w:t>
+            </w:r>
+          </w:p>
+        </w:tc>
+        <w:tc>
+          <w:tcPr>
+            <w:tcW w:type="dxa" w:w="8138"/>
+            <w:tcBorders>
+              <w:top w:val="single" w:color="BFBFBF" w:sz="4"/>
+              <w:left w:val="single" w:color="BFBFBF" w:sz="4"/>
+              <w:bottom w:val="single" w:color="BFBFBF" w:sz="4"/>
+              <w:right w:val="single" w:color="BFBFBF" w:sz="4"/>
+            </w:tcBorders>
+          </w:tcPr>
+          <w:p>
+            <w:pPr>
+              <w:spacing w:after="40"/>
+            </w:pPr>
+            <w:r>
+              <w:rPr>
+                <w:rFonts w:ascii="Malgun Gothic" w:hAnsi="Malgun Gothic" w:cs="Malgun Gothic" w:eastAsia="Malgun Gothic"/>
+                <w:b w:val="0"/>
+                <w:i w:val="0"/>
+                <w:sz w:val="20"/>
+              </w:rPr>
+              <w:t>am Ende는 결국이라는 표현입니다.</w:t>
+            </w:r>
+          </w:p>
+        </w:tc>
+      </w:tr>
+      <w:tr>
+        <w:tc>
+          <w:tcPr>
+            <w:tcW w:type="dxa" w:w="1500"/>
+            <w:tcBorders>
+              <w:top w:val="single" w:color="BFBFBF" w:sz="4"/>
+              <w:left w:val="single" w:color="BFBFBF" w:sz="4"/>
+              <w:bottom w:val="single" w:color="BFBFBF" w:sz="4"/>
+              <w:right w:val="single" w:color="BFBFBF" w:sz="4"/>
+            </w:tcBorders>
+            <w:shd w:fill="DEEAF6" w:color="auto" w:val="clear"/>
+          </w:tcPr>
+          <w:p>
+            <w:r>
+              <w:rPr>
+                <w:rFonts w:ascii="Malgun Gothic" w:hAnsi="Malgun Gothic" w:cs="Malgun Gothic" w:eastAsia="Malgun Gothic"/>
+                <w:b/>
+                <w:i w:val="0"/>
+                <w:color w:val="1F3864"/>
+                <w:sz w:val="20"/>
+              </w:rPr>
+              <w:t>시제</w:t>
+            </w:r>
+          </w:p>
+        </w:tc>
+        <w:tc>
+          <w:tcPr>
+            <w:tcW w:type="dxa" w:w="8138"/>
+            <w:tcBorders>
+              <w:top w:val="single" w:color="BFBFBF" w:sz="4"/>
+              <w:left w:val="single" w:color="BFBFBF" w:sz="4"/>
+              <w:bottom w:val="single" w:color="BFBFBF" w:sz="4"/>
+              <w:right w:val="single" w:color="BFBFBF" w:sz="4"/>
+            </w:tcBorders>
+          </w:tcPr>
+          <w:p>
+            <w:pPr>
+              <w:spacing w:after="40"/>
+            </w:pPr>
+            <w:r>
+              <w:rPr>
+                <w:rFonts w:ascii="Malgun Gothic" w:hAnsi="Malgun Gothic" w:cs="Malgun Gothic" w:eastAsia="Malgun Gothic"/>
+                <w:b w:val="0"/>
+                <w:i w:val="0"/>
+                <w:sz w:val="20"/>
+              </w:rPr>
+              <w:t>sind는 현재형이고 hätte ... sollen은 접속법 II 과거, Hat ... gelassen은 현재완료입니다.</w:t>
+            </w:r>
+          </w:p>
+        </w:tc>
+      </w:tr>
+    </w:tbl>
+    <w:p>
+      <w:pPr>
+        <w:spacing w:after="0"/>
+      </w:pPr>
+    </w:p>
+    <w:p>
+      <w:pPr>
+        <w:keepNext/>
+        <w:spacing w:before="160"/>
+      </w:pPr>
+      <w:r>
+        <w:rPr>
+          <w:rFonts w:ascii="Arial" w:hAnsi="Arial" w:cs="Arial" w:eastAsia="Malgun Gothic"/>
+          <w:b/>
+          <w:i w:val="0"/>
+          <w:sz w:val="22"/>
+        </w:rPr>
+        <w:t>28. Hanna: Wir werden es erfahren. Aber merken Sie sich eines: Wer lange manipuliert hat, wird am Ende selbst manipuliert, sei es von der Angst, sei es von den Umständen.</w:t>
+      </w:r>
+    </w:p>
+    <w:p>
+      <w:pPr>
+        <w:keepNext/>
+        <w:ind w:left="340"/>
+      </w:pPr>
+      <w:r>
+        <w:rPr>
+          <w:rFonts w:ascii="Malgun Gothic" w:hAnsi="Malgun Gothic" w:cs="Malgun Gothic" w:eastAsia="Malgun Gothic"/>
+          <w:b w:val="0"/>
+          <w:i/>
+          <w:color w:val="404040"/>
+          <w:sz w:val="20"/>
+        </w:rPr>
+        <w:t>곧 알게 되겠지요. 하지만 하나는 기억하세요. 오래 조작해 온 사람은 결국 자신도 두려움이든 상황이든 무언가에 조작당하게 됩니다.</w:t>
+      </w:r>
+    </w:p>
+    <w:tbl>
+      <w:tblPr>
+        <w:tblW w:type="auto" w:w="0"/>
+        <w:tblLayout w:type="fixed"/>
+        <w:tblLook w:firstColumn="1" w:firstRow="1" w:lastColumn="0" w:lastRow="0" w:noHBand="0" w:noVBand="1" w:val="04A0"/>
+      </w:tblPr>
+      <w:tblGrid>
+        <w:gridCol w:w="4819"/>
+        <w:gridCol w:w="4819"/>
+      </w:tblGrid>
+      <w:tr>
+        <w:tc>
+          <w:tcPr>
+            <w:tcW w:type="dxa" w:w="1500"/>
+            <w:tcBorders>
+              <w:top w:val="single" w:color="BFBFBF" w:sz="4"/>
+              <w:left w:val="single" w:color="BFBFBF" w:sz="4"/>
+              <w:bottom w:val="single" w:color="BFBFBF" w:sz="4"/>
+              <w:right w:val="single" w:color="BFBFBF" w:sz="4"/>
+            </w:tcBorders>
+            <w:shd w:fill="DEEAF6" w:color="auto" w:val="clear"/>
+          </w:tcPr>
+          <w:p>
+            <w:r>
+              <w:rPr>
+                <w:rFonts w:ascii="Malgun Gothic" w:hAnsi="Malgun Gothic" w:cs="Malgun Gothic" w:eastAsia="Malgun Gothic"/>
+                <w:b/>
+                <w:i w:val="0"/>
+                <w:color w:val="1F3864"/>
+                <w:sz w:val="20"/>
+              </w:rPr>
+              <w:t>주요 단어</w:t>
+            </w:r>
+          </w:p>
+        </w:tc>
+        <w:tc>
+          <w:tcPr>
+            <w:tcW w:type="dxa" w:w="8138"/>
+            <w:tcBorders>
+              <w:top w:val="single" w:color="BFBFBF" w:sz="4"/>
+              <w:left w:val="single" w:color="BFBFBF" w:sz="4"/>
+              <w:bottom w:val="single" w:color="BFBFBF" w:sz="4"/>
+              <w:right w:val="single" w:color="BFBFBF" w:sz="4"/>
+            </w:tcBorders>
+          </w:tcPr>
+          <w:p>
+            <w:pPr>
+              <w:spacing w:after="40"/>
+            </w:pPr>
+            <w:r>
+              <w:rPr>
+                <w:rFonts w:ascii="Arial" w:hAnsi="Arial" w:cs="Arial" w:eastAsia="Malgun Gothic"/>
+                <w:b/>
+                <w:i w:val="0"/>
+                <w:sz w:val="20"/>
+              </w:rPr>
+              <w:t>manipulieren</w:t>
+            </w:r>
+            <w:r>
+              <w:rPr>
+                <w:rFonts w:ascii="Malgun Gothic" w:hAnsi="Malgun Gothic" w:cs="Malgun Gothic" w:eastAsia="Malgun Gothic"/>
+                <w:b w:val="0"/>
+                <w:i w:val="0"/>
+                <w:sz w:val="20"/>
+              </w:rPr>
+              <w:t xml:space="preserve">  —  조작하다</w:t>
+            </w:r>
+          </w:p>
+          <w:p>
+            <w:pPr>
+              <w:spacing w:after="40"/>
+            </w:pPr>
+            <w:r>
+              <w:rPr>
+                <w:rFonts w:ascii="Arial" w:hAnsi="Arial" w:cs="Arial" w:eastAsia="Malgun Gothic"/>
+                <w:b/>
+                <w:i w:val="0"/>
+                <w:sz w:val="20"/>
+              </w:rPr>
+              <w:t>die Umstände (복수)</w:t>
+            </w:r>
+            <w:r>
+              <w:rPr>
+                <w:rFonts w:ascii="Malgun Gothic" w:hAnsi="Malgun Gothic" w:cs="Malgun Gothic" w:eastAsia="Malgun Gothic"/>
+                <w:b w:val="0"/>
+                <w:i w:val="0"/>
+                <w:sz w:val="20"/>
+              </w:rPr>
+              <w:t xml:space="preserve">  —  상황</w:t>
+            </w:r>
+          </w:p>
+          <w:p>
+            <w:pPr>
+              <w:spacing w:after="40"/>
+            </w:pPr>
+            <w:r>
+              <w:rPr>
+                <w:rFonts w:ascii="Arial" w:hAnsi="Arial" w:cs="Arial" w:eastAsia="Malgun Gothic"/>
+                <w:b/>
+                <w:i w:val="0"/>
+                <w:sz w:val="20"/>
+              </w:rPr>
+              <w:t>sich merken</w:t>
+            </w:r>
+            <w:r>
+              <w:rPr>
+                <w:rFonts w:ascii="Malgun Gothic" w:hAnsi="Malgun Gothic" w:cs="Malgun Gothic" w:eastAsia="Malgun Gothic"/>
+                <w:b w:val="0"/>
+                <w:i w:val="0"/>
+                <w:sz w:val="20"/>
+              </w:rPr>
+              <w:t xml:space="preserve">  —  기억해 두다</w:t>
+            </w:r>
+          </w:p>
+        </w:tc>
+      </w:tr>
+      <w:tr>
+        <w:tc>
+          <w:tcPr>
+            <w:tcW w:type="dxa" w:w="1500"/>
+            <w:tcBorders>
+              <w:top w:val="single" w:color="BFBFBF" w:sz="4"/>
+              <w:left w:val="single" w:color="BFBFBF" w:sz="4"/>
+              <w:bottom w:val="single" w:color="BFBFBF" w:sz="4"/>
+              <w:right w:val="single" w:color="BFBFBF" w:sz="4"/>
+            </w:tcBorders>
+            <w:shd w:fill="DEEAF6" w:color="auto" w:val="clear"/>
+          </w:tcPr>
+          <w:p>
+            <w:r>
+              <w:rPr>
+                <w:rFonts w:ascii="Malgun Gothic" w:hAnsi="Malgun Gothic" w:cs="Malgun Gothic" w:eastAsia="Malgun Gothic"/>
+                <w:b/>
+                <w:i w:val="0"/>
+                <w:color w:val="1F3864"/>
+                <w:sz w:val="20"/>
+              </w:rPr>
+              <w:t>문법</w:t>
+            </w:r>
+          </w:p>
+        </w:tc>
+        <w:tc>
+          <w:tcPr>
+            <w:tcW w:type="dxa" w:w="8138"/>
+            <w:tcBorders>
+              <w:top w:val="single" w:color="BFBFBF" w:sz="4"/>
+              <w:left w:val="single" w:color="BFBFBF" w:sz="4"/>
+              <w:bottom w:val="single" w:color="BFBFBF" w:sz="4"/>
+              <w:right w:val="single" w:color="BFBFBF" w:sz="4"/>
+            </w:tcBorders>
+          </w:tcPr>
+          <w:p>
+            <w:pPr>
+              <w:spacing w:after="40"/>
+            </w:pPr>
+            <w:r>
+              <w:rPr>
+                <w:rFonts w:ascii="Malgun Gothic" w:hAnsi="Malgun Gothic" w:cs="Malgun Gothic" w:eastAsia="Malgun Gothic"/>
+                <w:b w:val="0"/>
+                <w:i w:val="0"/>
+                <w:sz w:val="20"/>
+              </w:rPr>
+              <w:t>Wer lange manipuliert hat, wird am Ende selbst manipuliert에서 Wer절이 주어이고 수동이 쓰입니다. sei es von der Angst, sei es von den Umständen은 접속법 I 관용 구문입니다.</w:t>
+            </w:r>
+          </w:p>
+        </w:tc>
+      </w:tr>
+      <w:tr>
+        <w:tc>
+          <w:tcPr>
+            <w:tcW w:type="dxa" w:w="1500"/>
+            <w:tcBorders>
+              <w:top w:val="single" w:color="BFBFBF" w:sz="4"/>
+              <w:left w:val="single" w:color="BFBFBF" w:sz="4"/>
+              <w:bottom w:val="single" w:color="BFBFBF" w:sz="4"/>
+              <w:right w:val="single" w:color="BFBFBF" w:sz="4"/>
+            </w:tcBorders>
+            <w:shd w:fill="DEEAF6" w:color="auto" w:val="clear"/>
+          </w:tcPr>
+          <w:p>
+            <w:r>
+              <w:rPr>
+                <w:rFonts w:ascii="Malgun Gothic" w:hAnsi="Malgun Gothic" w:cs="Malgun Gothic" w:eastAsia="Malgun Gothic"/>
+                <w:b/>
+                <w:i w:val="0"/>
+                <w:color w:val="1F3864"/>
+                <w:sz w:val="20"/>
+              </w:rPr>
+              <w:t>표현</w:t>
+            </w:r>
+          </w:p>
+        </w:tc>
+        <w:tc>
+          <w:tcPr>
+            <w:tcW w:type="dxa" w:w="8138"/>
+            <w:tcBorders>
+              <w:top w:val="single" w:color="BFBFBF" w:sz="4"/>
+              <w:left w:val="single" w:color="BFBFBF" w:sz="4"/>
+              <w:bottom w:val="single" w:color="BFBFBF" w:sz="4"/>
+              <w:right w:val="single" w:color="BFBFBF" w:sz="4"/>
+            </w:tcBorders>
+          </w:tcPr>
+          <w:p>
+            <w:pPr>
+              <w:spacing w:after="40"/>
+            </w:pPr>
+            <w:r>
+              <w:rPr>
+                <w:rFonts w:ascii="Malgun Gothic" w:hAnsi="Malgun Gothic" w:cs="Malgun Gothic" w:eastAsia="Malgun Gothic"/>
+                <w:b w:val="0"/>
+                <w:i w:val="0"/>
+                <w:sz w:val="20"/>
+              </w:rPr>
+              <w:t>merken Sie sich는 존칭 명령형입니다.</w:t>
+            </w:r>
+          </w:p>
+        </w:tc>
+      </w:tr>
+      <w:tr>
+        <w:tc>
+          <w:tcPr>
+            <w:tcW w:type="dxa" w:w="1500"/>
+            <w:tcBorders>
+              <w:top w:val="single" w:color="BFBFBF" w:sz="4"/>
+              <w:left w:val="single" w:color="BFBFBF" w:sz="4"/>
+              <w:bottom w:val="single" w:color="BFBFBF" w:sz="4"/>
+              <w:right w:val="single" w:color="BFBFBF" w:sz="4"/>
+            </w:tcBorders>
+            <w:shd w:fill="DEEAF6" w:color="auto" w:val="clear"/>
+          </w:tcPr>
+          <w:p>
+            <w:r>
+              <w:rPr>
+                <w:rFonts w:ascii="Malgun Gothic" w:hAnsi="Malgun Gothic" w:cs="Malgun Gothic" w:eastAsia="Malgun Gothic"/>
+                <w:b/>
+                <w:i w:val="0"/>
+                <w:color w:val="1F3864"/>
+                <w:sz w:val="20"/>
+              </w:rPr>
+              <w:t>시제</w:t>
+            </w:r>
+          </w:p>
+        </w:tc>
+        <w:tc>
+          <w:tcPr>
+            <w:tcW w:type="dxa" w:w="8138"/>
+            <w:tcBorders>
+              <w:top w:val="single" w:color="BFBFBF" w:sz="4"/>
+              <w:left w:val="single" w:color="BFBFBF" w:sz="4"/>
+              <w:bottom w:val="single" w:color="BFBFBF" w:sz="4"/>
+              <w:right w:val="single" w:color="BFBFBF" w:sz="4"/>
+            </w:tcBorders>
+          </w:tcPr>
+          <w:p>
+            <w:pPr>
+              <w:spacing w:after="40"/>
+            </w:pPr>
+            <w:r>
+              <w:rPr>
+                <w:rFonts w:ascii="Malgun Gothic" w:hAnsi="Malgun Gothic" w:cs="Malgun Gothic" w:eastAsia="Malgun Gothic"/>
+                <w:b w:val="0"/>
+                <w:i w:val="0"/>
+                <w:sz w:val="20"/>
+              </w:rPr>
+              <w:t>werden ... erfahren은 미래형이고 manipuliert hat은 현재완료, wird ... manipuliert는 현재 수동입니다.</w:t>
+            </w:r>
+          </w:p>
+        </w:tc>
+      </w:tr>
+    </w:tbl>
+    <w:p>
+      <w:pPr>
+        <w:spacing w:after="0"/>
+      </w:pPr>
+    </w:p>
+    <w:p>
+      <w:pPr>
+        <w:keepNext/>
+        <w:spacing w:before="160"/>
+      </w:pPr>
+      <w:r>
+        <w:rPr>
+          <w:rFonts w:ascii="Arial" w:hAnsi="Arial" w:cs="Arial" w:eastAsia="Malgun Gothic"/>
+          <w:b/>
+          <w:i w:val="0"/>
+          <w:sz w:val="22"/>
+        </w:rPr>
+        <w:t>29. Jonas: Ich denke an Roth, wie er im Jeans-Outfit vor den Beamten stand, ohne Krawatte, ohne Pose. Vielleicht war das der erste Moment seit Jahren, in dem er nicht gespielt hat.</w:t>
+      </w:r>
+    </w:p>
+    <w:p>
+      <w:pPr>
+        <w:keepNext/>
+        <w:ind w:left="340"/>
+      </w:pPr>
+      <w:r>
+        <w:rPr>
+          <w:rFonts w:ascii="Malgun Gothic" w:hAnsi="Malgun Gothic" w:cs="Malgun Gothic" w:eastAsia="Malgun Gothic"/>
+          <w:b w:val="0"/>
+          <w:i/>
+          <w:color w:val="404040"/>
+          <w:sz w:val="20"/>
+        </w:rPr>
+        <w:t>청바지 차림으로 넥타이도 포즈도 없이 수사관들 앞에 서 있던 로트를 떠올린다. 어쩌면 몇 년 만에 처음으로 연기하지 않은 순간이었는지도 모른다.</w:t>
+      </w:r>
+    </w:p>
+    <w:tbl>
+      <w:tblPr>
+        <w:tblW w:type="auto" w:w="0"/>
+        <w:tblLayout w:type="fixed"/>
+        <w:tblLook w:firstColumn="1" w:firstRow="1" w:lastColumn="0" w:lastRow="0" w:noHBand="0" w:noVBand="1" w:val="04A0"/>
+      </w:tblPr>
+      <w:tblGrid>
+        <w:gridCol w:w="4819"/>
+        <w:gridCol w:w="4819"/>
+      </w:tblGrid>
+      <w:tr>
+        <w:tc>
+          <w:tcPr>
+            <w:tcW w:type="dxa" w:w="1500"/>
+            <w:tcBorders>
+              <w:top w:val="single" w:color="BFBFBF" w:sz="4"/>
+              <w:left w:val="single" w:color="BFBFBF" w:sz="4"/>
+              <w:bottom w:val="single" w:color="BFBFBF" w:sz="4"/>
+              <w:right w:val="single" w:color="BFBFBF" w:sz="4"/>
+            </w:tcBorders>
+            <w:shd w:fill="DEEAF6" w:color="auto" w:val="clear"/>
+          </w:tcPr>
+          <w:p>
+            <w:r>
+              <w:rPr>
+                <w:rFonts w:ascii="Malgun Gothic" w:hAnsi="Malgun Gothic" w:cs="Malgun Gothic" w:eastAsia="Malgun Gothic"/>
+                <w:b/>
+                <w:i w:val="0"/>
+                <w:color w:val="1F3864"/>
+                <w:sz w:val="20"/>
+              </w:rPr>
+              <w:t>주요 단어</w:t>
+            </w:r>
+          </w:p>
+        </w:tc>
+        <w:tc>
+          <w:tcPr>
+            <w:tcW w:type="dxa" w:w="8138"/>
+            <w:tcBorders>
+              <w:top w:val="single" w:color="BFBFBF" w:sz="4"/>
+              <w:left w:val="single" w:color="BFBFBF" w:sz="4"/>
+              <w:bottom w:val="single" w:color="BFBFBF" w:sz="4"/>
+              <w:right w:val="single" w:color="BFBFBF" w:sz="4"/>
+            </w:tcBorders>
+          </w:tcPr>
+          <w:p>
+            <w:pPr>
+              <w:spacing w:after="40"/>
+            </w:pPr>
+            <w:r>
+              <w:rPr>
+                <w:rFonts w:ascii="Arial" w:hAnsi="Arial" w:cs="Arial" w:eastAsia="Malgun Gothic"/>
+                <w:b/>
+                <w:i w:val="0"/>
+                <w:sz w:val="20"/>
+              </w:rPr>
+              <w:t>die Pose, -n</w:t>
+            </w:r>
+            <w:r>
+              <w:rPr>
+                <w:rFonts w:ascii="Malgun Gothic" w:hAnsi="Malgun Gothic" w:cs="Malgun Gothic" w:eastAsia="Malgun Gothic"/>
+                <w:b w:val="0"/>
+                <w:i w:val="0"/>
+                <w:sz w:val="20"/>
+              </w:rPr>
+              <w:t xml:space="preserve">  —  자세</w:t>
+            </w:r>
+          </w:p>
+          <w:p>
+            <w:pPr>
+              <w:spacing w:after="40"/>
+            </w:pPr>
+            <w:r>
+              <w:rPr>
+                <w:rFonts w:ascii="Arial" w:hAnsi="Arial" w:cs="Arial" w:eastAsia="Malgun Gothic"/>
+                <w:b/>
+                <w:i w:val="0"/>
+                <w:sz w:val="20"/>
+              </w:rPr>
+              <w:t>spielen</w:t>
+            </w:r>
+            <w:r>
+              <w:rPr>
+                <w:rFonts w:ascii="Malgun Gothic" w:hAnsi="Malgun Gothic" w:cs="Malgun Gothic" w:eastAsia="Malgun Gothic"/>
+                <w:b w:val="0"/>
+                <w:i w:val="0"/>
+                <w:sz w:val="20"/>
+              </w:rPr>
+              <w:t xml:space="preserve">  —  연기하다</w:t>
+            </w:r>
+          </w:p>
+          <w:p>
+            <w:pPr>
+              <w:spacing w:after="40"/>
+            </w:pPr>
+            <w:r>
+              <w:rPr>
+                <w:rFonts w:ascii="Arial" w:hAnsi="Arial" w:cs="Arial" w:eastAsia="Malgun Gothic"/>
+                <w:b/>
+                <w:i w:val="0"/>
+                <w:sz w:val="20"/>
+              </w:rPr>
+              <w:t>vielleicht</w:t>
+            </w:r>
+            <w:r>
+              <w:rPr>
+                <w:rFonts w:ascii="Malgun Gothic" w:hAnsi="Malgun Gothic" w:cs="Malgun Gothic" w:eastAsia="Malgun Gothic"/>
+                <w:b w:val="0"/>
+                <w:i w:val="0"/>
+                <w:sz w:val="20"/>
+              </w:rPr>
+              <w:t xml:space="preserve">  —  어쩌면</w:t>
+            </w:r>
+          </w:p>
+        </w:tc>
+      </w:tr>
+      <w:tr>
+        <w:tc>
+          <w:tcPr>
+            <w:tcW w:type="dxa" w:w="1500"/>
+            <w:tcBorders>
+              <w:top w:val="single" w:color="BFBFBF" w:sz="4"/>
+              <w:left w:val="single" w:color="BFBFBF" w:sz="4"/>
+              <w:bottom w:val="single" w:color="BFBFBF" w:sz="4"/>
+              <w:right w:val="single" w:color="BFBFBF" w:sz="4"/>
+            </w:tcBorders>
+            <w:shd w:fill="DEEAF6" w:color="auto" w:val="clear"/>
+          </w:tcPr>
+          <w:p>
+            <w:r>
+              <w:rPr>
+                <w:rFonts w:ascii="Malgun Gothic" w:hAnsi="Malgun Gothic" w:cs="Malgun Gothic" w:eastAsia="Malgun Gothic"/>
+                <w:b/>
+                <w:i w:val="0"/>
+                <w:color w:val="1F3864"/>
+                <w:sz w:val="20"/>
+              </w:rPr>
+              <w:t>문법</w:t>
+            </w:r>
+          </w:p>
+        </w:tc>
+        <w:tc>
+          <w:tcPr>
+            <w:tcW w:type="dxa" w:w="8138"/>
+            <w:tcBorders>
+              <w:top w:val="single" w:color="BFBFBF" w:sz="4"/>
+              <w:left w:val="single" w:color="BFBFBF" w:sz="4"/>
+              <w:bottom w:val="single" w:color="BFBFBF" w:sz="4"/>
+              <w:right w:val="single" w:color="BFBFBF" w:sz="4"/>
+            </w:tcBorders>
+          </w:tcPr>
+          <w:p>
+            <w:pPr>
+              <w:spacing w:after="40"/>
+            </w:pPr>
+            <w:r>
+              <w:rPr>
+                <w:rFonts w:ascii="Malgun Gothic" w:hAnsi="Malgun Gothic" w:cs="Malgun Gothic" w:eastAsia="Malgun Gothic"/>
+                <w:b w:val="0"/>
+                <w:i w:val="0"/>
+                <w:sz w:val="20"/>
+              </w:rPr>
+              <w:t>wie er im Jeans-Outfit vor den Beamten stand에서 wie절의 stand가 끝에 옵니다. der erste Moment seit Jahren, in dem er nicht gespielt hat에서 in dem은 관계대명사입니다.</w:t>
+            </w:r>
+          </w:p>
+        </w:tc>
+      </w:tr>
+      <w:tr>
+        <w:tc>
+          <w:tcPr>
+            <w:tcW w:type="dxa" w:w="1500"/>
+            <w:tcBorders>
+              <w:top w:val="single" w:color="BFBFBF" w:sz="4"/>
+              <w:left w:val="single" w:color="BFBFBF" w:sz="4"/>
+              <w:bottom w:val="single" w:color="BFBFBF" w:sz="4"/>
+              <w:right w:val="single" w:color="BFBFBF" w:sz="4"/>
+            </w:tcBorders>
+            <w:shd w:fill="DEEAF6" w:color="auto" w:val="clear"/>
+          </w:tcPr>
+          <w:p>
+            <w:r>
+              <w:rPr>
+                <w:rFonts w:ascii="Malgun Gothic" w:hAnsi="Malgun Gothic" w:cs="Malgun Gothic" w:eastAsia="Malgun Gothic"/>
+                <w:b/>
+                <w:i w:val="0"/>
+                <w:color w:val="1F3864"/>
+                <w:sz w:val="20"/>
+              </w:rPr>
+              <w:t>표현</w:t>
+            </w:r>
+          </w:p>
+        </w:tc>
+        <w:tc>
+          <w:tcPr>
+            <w:tcW w:type="dxa" w:w="8138"/>
+            <w:tcBorders>
+              <w:top w:val="single" w:color="BFBFBF" w:sz="4"/>
+              <w:left w:val="single" w:color="BFBFBF" w:sz="4"/>
+              <w:bottom w:val="single" w:color="BFBFBF" w:sz="4"/>
+              <w:right w:val="single" w:color="BFBFBF" w:sz="4"/>
+            </w:tcBorders>
+          </w:tcPr>
+          <w:p>
+            <w:pPr>
+              <w:spacing w:after="40"/>
+            </w:pPr>
+            <w:r>
+              <w:rPr>
+                <w:rFonts w:ascii="Malgun Gothic" w:hAnsi="Malgun Gothic" w:cs="Malgun Gothic" w:eastAsia="Malgun Gothic"/>
+                <w:b w:val="0"/>
+                <w:i w:val="0"/>
+                <w:sz w:val="20"/>
+              </w:rPr>
+              <w:t>ohne Krawatte, ohne Pose는 ohne + 4격입니다.</w:t>
+            </w:r>
+          </w:p>
+        </w:tc>
+      </w:tr>
+      <w:tr>
+        <w:tc>
+          <w:tcPr>
+            <w:tcW w:type="dxa" w:w="1500"/>
+            <w:tcBorders>
+              <w:top w:val="single" w:color="BFBFBF" w:sz="4"/>
+              <w:left w:val="single" w:color="BFBFBF" w:sz="4"/>
+              <w:bottom w:val="single" w:color="BFBFBF" w:sz="4"/>
+              <w:right w:val="single" w:color="BFBFBF" w:sz="4"/>
+            </w:tcBorders>
+            <w:shd w:fill="DEEAF6" w:color="auto" w:val="clear"/>
+          </w:tcPr>
+          <w:p>
+            <w:r>
+              <w:rPr>
+                <w:rFonts w:ascii="Malgun Gothic" w:hAnsi="Malgun Gothic" w:cs="Malgun Gothic" w:eastAsia="Malgun Gothic"/>
+                <w:b/>
+                <w:i w:val="0"/>
+                <w:color w:val="1F3864"/>
+                <w:sz w:val="20"/>
+              </w:rPr>
+              <w:t>시제</w:t>
+            </w:r>
+          </w:p>
+        </w:tc>
+        <w:tc>
+          <w:tcPr>
+            <w:tcW w:type="dxa" w:w="8138"/>
+            <w:tcBorders>
+              <w:top w:val="single" w:color="BFBFBF" w:sz="4"/>
+              <w:left w:val="single" w:color="BFBFBF" w:sz="4"/>
+              <w:bottom w:val="single" w:color="BFBFBF" w:sz="4"/>
+              <w:right w:val="single" w:color="BFBFBF" w:sz="4"/>
+            </w:tcBorders>
+          </w:tcPr>
+          <w:p>
+            <w:pPr>
+              <w:spacing w:after="40"/>
+            </w:pPr>
+            <w:r>
+              <w:rPr>
+                <w:rFonts w:ascii="Malgun Gothic" w:hAnsi="Malgun Gothic" w:cs="Malgun Gothic" w:eastAsia="Malgun Gothic"/>
+                <w:b w:val="0"/>
+                <w:i w:val="0"/>
+                <w:sz w:val="20"/>
+              </w:rPr>
+              <w:t>denke는 현재형이고 stand, war는 과거형, gespielt hat은 현재완료입니다.</w:t>
+            </w:r>
+          </w:p>
+        </w:tc>
+      </w:tr>
+    </w:tbl>
+    <w:p>
+      <w:pPr>
+        <w:spacing w:after="0"/>
+      </w:pPr>
+    </w:p>
+    <w:p>
+      <w:pPr>
+        <w:keepNext/>
+        <w:spacing w:before="160"/>
+      </w:pPr>
+      <w:r>
+        <w:rPr>
+          <w:rFonts w:ascii="Arial" w:hAnsi="Arial" w:cs="Arial" w:eastAsia="Malgun Gothic"/>
+          <w:b/>
+          <w:i w:val="0"/>
+          <w:sz w:val="22"/>
+        </w:rPr>
+        <w:t>30. Sophie: Ich habe Lena angerufen. Sie sagt, im Büro herrscht eine seltsame Stille. Niemand redet, alle starren auf ihre Bildschirme, und die Sekretärin weint am Empfang.</w:t>
+      </w:r>
+    </w:p>
+    <w:p>
+      <w:pPr>
+        <w:keepNext/>
+        <w:ind w:left="340"/>
+      </w:pPr>
+      <w:r>
+        <w:rPr>
+          <w:rFonts w:ascii="Malgun Gothic" w:hAnsi="Malgun Gothic" w:cs="Malgun Gothic" w:eastAsia="Malgun Gothic"/>
+          <w:b w:val="0"/>
+          <w:i/>
+          <w:color w:val="404040"/>
+          <w:sz w:val="20"/>
+        </w:rPr>
+        <w:t>레나에게 전화했어. 사무실에는 이상한 정적이 감돈대. 아무도 말하지 않고 모두 화면만 응시하고 접수처 비서는 울고 있대.</w:t>
+      </w:r>
+    </w:p>
+    <w:tbl>
+      <w:tblPr>
+        <w:tblW w:type="auto" w:w="0"/>
+        <w:tblLayout w:type="fixed"/>
+        <w:tblLook w:firstColumn="1" w:firstRow="1" w:lastColumn="0" w:lastRow="0" w:noHBand="0" w:noVBand="1" w:val="04A0"/>
+      </w:tblPr>
+      <w:tblGrid>
+        <w:gridCol w:w="4819"/>
+        <w:gridCol w:w="4819"/>
+      </w:tblGrid>
+      <w:tr>
+        <w:tc>
+          <w:tcPr>
+            <w:tcW w:type="dxa" w:w="1500"/>
+            <w:tcBorders>
+              <w:top w:val="single" w:color="BFBFBF" w:sz="4"/>
+              <w:left w:val="single" w:color="BFBFBF" w:sz="4"/>
+              <w:bottom w:val="single" w:color="BFBFBF" w:sz="4"/>
+              <w:right w:val="single" w:color="BFBFBF" w:sz="4"/>
+            </w:tcBorders>
+            <w:shd w:fill="DEEAF6" w:color="auto" w:val="clear"/>
+          </w:tcPr>
+          <w:p>
+            <w:r>
+              <w:rPr>
+                <w:rFonts w:ascii="Malgun Gothic" w:hAnsi="Malgun Gothic" w:cs="Malgun Gothic" w:eastAsia="Malgun Gothic"/>
+                <w:b/>
+                <w:i w:val="0"/>
+                <w:color w:val="1F3864"/>
+                <w:sz w:val="20"/>
+              </w:rPr>
+              <w:t>주요 단어</w:t>
+            </w:r>
+          </w:p>
+        </w:tc>
+        <w:tc>
+          <w:tcPr>
+            <w:tcW w:type="dxa" w:w="8138"/>
+            <w:tcBorders>
+              <w:top w:val="single" w:color="BFBFBF" w:sz="4"/>
+              <w:left w:val="single" w:color="BFBFBF" w:sz="4"/>
+              <w:bottom w:val="single" w:color="BFBFBF" w:sz="4"/>
+              <w:right w:val="single" w:color="BFBFBF" w:sz="4"/>
+            </w:tcBorders>
+          </w:tcPr>
+          <w:p>
+            <w:pPr>
+              <w:spacing w:after="40"/>
+            </w:pPr>
+            <w:r>
+              <w:rPr>
+                <w:rFonts w:ascii="Arial" w:hAnsi="Arial" w:cs="Arial" w:eastAsia="Malgun Gothic"/>
+                <w:b/>
+                <w:i w:val="0"/>
+                <w:sz w:val="20"/>
+              </w:rPr>
+              <w:t>herrschen</w:t>
+            </w:r>
+            <w:r>
+              <w:rPr>
+                <w:rFonts w:ascii="Malgun Gothic" w:hAnsi="Malgun Gothic" w:cs="Malgun Gothic" w:eastAsia="Malgun Gothic"/>
+                <w:b w:val="0"/>
+                <w:i w:val="0"/>
+                <w:sz w:val="20"/>
+              </w:rPr>
+              <w:t xml:space="preserve">  —  감돌다</w:t>
+            </w:r>
+          </w:p>
+          <w:p>
+            <w:pPr>
+              <w:spacing w:after="40"/>
+            </w:pPr>
+            <w:r>
+              <w:rPr>
+                <w:rFonts w:ascii="Arial" w:hAnsi="Arial" w:cs="Arial" w:eastAsia="Malgun Gothic"/>
+                <w:b/>
+                <w:i w:val="0"/>
+                <w:sz w:val="20"/>
+              </w:rPr>
+              <w:t>die Stille (단수)</w:t>
+            </w:r>
+            <w:r>
+              <w:rPr>
+                <w:rFonts w:ascii="Malgun Gothic" w:hAnsi="Malgun Gothic" w:cs="Malgun Gothic" w:eastAsia="Malgun Gothic"/>
+                <w:b w:val="0"/>
+                <w:i w:val="0"/>
+                <w:sz w:val="20"/>
+              </w:rPr>
+              <w:t xml:space="preserve">  —  정적</w:t>
+            </w:r>
+          </w:p>
+          <w:p>
+            <w:pPr>
+              <w:spacing w:after="40"/>
+            </w:pPr>
+            <w:r>
+              <w:rPr>
+                <w:rFonts w:ascii="Arial" w:hAnsi="Arial" w:cs="Arial" w:eastAsia="Malgun Gothic"/>
+                <w:b/>
+                <w:i w:val="0"/>
+                <w:sz w:val="20"/>
+              </w:rPr>
+              <w:t>starren</w:t>
+            </w:r>
+            <w:r>
+              <w:rPr>
+                <w:rFonts w:ascii="Malgun Gothic" w:hAnsi="Malgun Gothic" w:cs="Malgun Gothic" w:eastAsia="Malgun Gothic"/>
+                <w:b w:val="0"/>
+                <w:i w:val="0"/>
+                <w:sz w:val="20"/>
+              </w:rPr>
+              <w:t xml:space="preserve">  —  응시하다</w:t>
+            </w:r>
+          </w:p>
+        </w:tc>
+      </w:tr>
+      <w:tr>
+        <w:tc>
+          <w:tcPr>
+            <w:tcW w:type="dxa" w:w="1500"/>
+            <w:tcBorders>
+              <w:top w:val="single" w:color="BFBFBF" w:sz="4"/>
+              <w:left w:val="single" w:color="BFBFBF" w:sz="4"/>
+              <w:bottom w:val="single" w:color="BFBFBF" w:sz="4"/>
+              <w:right w:val="single" w:color="BFBFBF" w:sz="4"/>
+            </w:tcBorders>
+            <w:shd w:fill="DEEAF6" w:color="auto" w:val="clear"/>
+          </w:tcPr>
+          <w:p>
+            <w:r>
+              <w:rPr>
+                <w:rFonts w:ascii="Malgun Gothic" w:hAnsi="Malgun Gothic" w:cs="Malgun Gothic" w:eastAsia="Malgun Gothic"/>
+                <w:b/>
+                <w:i w:val="0"/>
+                <w:color w:val="1F3864"/>
+                <w:sz w:val="20"/>
+              </w:rPr>
+              <w:t>문법</w:t>
+            </w:r>
+          </w:p>
+        </w:tc>
+        <w:tc>
+          <w:tcPr>
+            <w:tcW w:type="dxa" w:w="8138"/>
+            <w:tcBorders>
+              <w:top w:val="single" w:color="BFBFBF" w:sz="4"/>
+              <w:left w:val="single" w:color="BFBFBF" w:sz="4"/>
+              <w:bottom w:val="single" w:color="BFBFBF" w:sz="4"/>
+              <w:right w:val="single" w:color="BFBFBF" w:sz="4"/>
+            </w:tcBorders>
+          </w:tcPr>
+          <w:p>
+            <w:pPr>
+              <w:spacing w:after="40"/>
+            </w:pPr>
+            <w:r>
+              <w:rPr>
+                <w:rFonts w:ascii="Malgun Gothic" w:hAnsi="Malgun Gothic" w:cs="Malgun Gothic" w:eastAsia="Malgun Gothic"/>
+                <w:b w:val="0"/>
+                <w:i w:val="0"/>
+                <w:sz w:val="20"/>
+              </w:rPr>
+              <w:t>Sie sagt, im Büro herrscht eine seltsame Stille에서 dass가 생략된 문장입니다. Niemand redet, alle starren auf ihre Bildschirme는 병렬 주절입니다.</w:t>
+            </w:r>
+          </w:p>
+        </w:tc>
+      </w:tr>
+      <w:tr>
+        <w:tc>
+          <w:tcPr>
+            <w:tcW w:type="dxa" w:w="1500"/>
+            <w:tcBorders>
+              <w:top w:val="single" w:color="BFBFBF" w:sz="4"/>
+              <w:left w:val="single" w:color="BFBFBF" w:sz="4"/>
+              <w:bottom w:val="single" w:color="BFBFBF" w:sz="4"/>
+              <w:right w:val="single" w:color="BFBFBF" w:sz="4"/>
+            </w:tcBorders>
+            <w:shd w:fill="DEEAF6" w:color="auto" w:val="clear"/>
+          </w:tcPr>
+          <w:p>
+            <w:r>
+              <w:rPr>
+                <w:rFonts w:ascii="Malgun Gothic" w:hAnsi="Malgun Gothic" w:cs="Malgun Gothic" w:eastAsia="Malgun Gothic"/>
+                <w:b/>
+                <w:i w:val="0"/>
+                <w:color w:val="1F3864"/>
+                <w:sz w:val="20"/>
+              </w:rPr>
+              <w:t>표현</w:t>
+            </w:r>
+          </w:p>
+        </w:tc>
+        <w:tc>
+          <w:tcPr>
+            <w:tcW w:type="dxa" w:w="8138"/>
+            <w:tcBorders>
+              <w:top w:val="single" w:color="BFBFBF" w:sz="4"/>
+              <w:left w:val="single" w:color="BFBFBF" w:sz="4"/>
+              <w:bottom w:val="single" w:color="BFBFBF" w:sz="4"/>
+              <w:right w:val="single" w:color="BFBFBF" w:sz="4"/>
+            </w:tcBorders>
+          </w:tcPr>
+          <w:p>
+            <w:pPr>
+              <w:spacing w:after="40"/>
+            </w:pPr>
+            <w:r>
+              <w:rPr>
+                <w:rFonts w:ascii="Malgun Gothic" w:hAnsi="Malgun Gothic" w:cs="Malgun Gothic" w:eastAsia="Malgun Gothic"/>
+                <w:b w:val="0"/>
+                <w:i w:val="0"/>
+                <w:sz w:val="20"/>
+              </w:rPr>
+              <w:t>am Empfang은 an dem Empfang의 축약입니다.</w:t>
+            </w:r>
+          </w:p>
+        </w:tc>
+      </w:tr>
+      <w:tr>
+        <w:tc>
+          <w:tcPr>
+            <w:tcW w:type="dxa" w:w="1500"/>
+            <w:tcBorders>
+              <w:top w:val="single" w:color="BFBFBF" w:sz="4"/>
+              <w:left w:val="single" w:color="BFBFBF" w:sz="4"/>
+              <w:bottom w:val="single" w:color="BFBFBF" w:sz="4"/>
+              <w:right w:val="single" w:color="BFBFBF" w:sz="4"/>
+            </w:tcBorders>
+            <w:shd w:fill="DEEAF6" w:color="auto" w:val="clear"/>
+          </w:tcPr>
+          <w:p>
+            <w:r>
+              <w:rPr>
+                <w:rFonts w:ascii="Malgun Gothic" w:hAnsi="Malgun Gothic" w:cs="Malgun Gothic" w:eastAsia="Malgun Gothic"/>
+                <w:b/>
+                <w:i w:val="0"/>
+                <w:color w:val="1F3864"/>
+                <w:sz w:val="20"/>
+              </w:rPr>
+              <w:t>시제</w:t>
+            </w:r>
+          </w:p>
+        </w:tc>
+        <w:tc>
+          <w:tcPr>
+            <w:tcW w:type="dxa" w:w="8138"/>
+            <w:tcBorders>
+              <w:top w:val="single" w:color="BFBFBF" w:sz="4"/>
+              <w:left w:val="single" w:color="BFBFBF" w:sz="4"/>
+              <w:bottom w:val="single" w:color="BFBFBF" w:sz="4"/>
+              <w:right w:val="single" w:color="BFBFBF" w:sz="4"/>
+            </w:tcBorders>
+          </w:tcPr>
+          <w:p>
+            <w:pPr>
+              <w:spacing w:after="40"/>
+            </w:pPr>
+            <w:r>
+              <w:rPr>
+                <w:rFonts w:ascii="Malgun Gothic" w:hAnsi="Malgun Gothic" w:cs="Malgun Gothic" w:eastAsia="Malgun Gothic"/>
+                <w:b w:val="0"/>
+                <w:i w:val="0"/>
+                <w:sz w:val="20"/>
+              </w:rPr>
+              <w:t>habe ... angerufen은 현재완료이고 sagt, herrscht, redet, starren, weint는 현재형입니다.</w:t>
+            </w:r>
+          </w:p>
+        </w:tc>
+      </w:tr>
+    </w:tbl>
+    <w:p>
+      <w:pPr>
+        <w:spacing w:after="0"/>
+      </w:pPr>
+    </w:p>
+    <w:p>
+      <w:pPr>
+        <w:keepNext/>
+        <w:spacing w:before="160"/>
+      </w:pPr>
+      <w:r>
+        <w:rPr>
+          <w:rFonts w:ascii="Arial" w:hAnsi="Arial" w:cs="Arial" w:eastAsia="Malgun Gothic"/>
+          <w:b/>
+          <w:i w:val="0"/>
+          <w:sz w:val="22"/>
+        </w:rPr>
+        <w:t>31. Jonas: Das klingt nicht nach Triumph. Es klingt nach einer Familie, die ihren Vater verliert, auch wenn er ein schlechter war.</w:t>
+      </w:r>
+    </w:p>
+    <w:p>
+      <w:pPr>
+        <w:keepNext/>
+        <w:ind w:left="340"/>
+      </w:pPr>
+      <w:r>
+        <w:rPr>
+          <w:rFonts w:ascii="Malgun Gothic" w:hAnsi="Malgun Gothic" w:cs="Malgun Gothic" w:eastAsia="Malgun Gothic"/>
+          <w:b w:val="0"/>
+          <w:i/>
+          <w:color w:val="404040"/>
+          <w:sz w:val="20"/>
+        </w:rPr>
+        <w:t>승리의 소리 같지는 않네. 나쁜 아버지였더라도 아버지를 잃는 가족의 소리 같아.</w:t>
+      </w:r>
+    </w:p>
+    <w:tbl>
+      <w:tblPr>
+        <w:tblW w:type="auto" w:w="0"/>
+        <w:tblLayout w:type="fixed"/>
+        <w:tblLook w:firstColumn="1" w:firstRow="1" w:lastColumn="0" w:lastRow="0" w:noHBand="0" w:noVBand="1" w:val="04A0"/>
+      </w:tblPr>
+      <w:tblGrid>
+        <w:gridCol w:w="4819"/>
+        <w:gridCol w:w="4819"/>
+      </w:tblGrid>
+      <w:tr>
+        <w:tc>
+          <w:tcPr>
+            <w:tcW w:type="dxa" w:w="1500"/>
+            <w:tcBorders>
+              <w:top w:val="single" w:color="BFBFBF" w:sz="4"/>
+              <w:left w:val="single" w:color="BFBFBF" w:sz="4"/>
+              <w:bottom w:val="single" w:color="BFBFBF" w:sz="4"/>
+              <w:right w:val="single" w:color="BFBFBF" w:sz="4"/>
+            </w:tcBorders>
+            <w:shd w:fill="DEEAF6" w:color="auto" w:val="clear"/>
+          </w:tcPr>
+          <w:p>
+            <w:r>
+              <w:rPr>
+                <w:rFonts w:ascii="Malgun Gothic" w:hAnsi="Malgun Gothic" w:cs="Malgun Gothic" w:eastAsia="Malgun Gothic"/>
+                <w:b/>
+                <w:i w:val="0"/>
+                <w:color w:val="1F3864"/>
+                <w:sz w:val="20"/>
+              </w:rPr>
+              <w:t>주요 단어</w:t>
+            </w:r>
+          </w:p>
+        </w:tc>
+        <w:tc>
+          <w:tcPr>
+            <w:tcW w:type="dxa" w:w="8138"/>
+            <w:tcBorders>
+              <w:top w:val="single" w:color="BFBFBF" w:sz="4"/>
+              <w:left w:val="single" w:color="BFBFBF" w:sz="4"/>
+              <w:bottom w:val="single" w:color="BFBFBF" w:sz="4"/>
+              <w:right w:val="single" w:color="BFBFBF" w:sz="4"/>
+            </w:tcBorders>
+          </w:tcPr>
+          <w:p>
+            <w:pPr>
+              <w:spacing w:after="40"/>
+            </w:pPr>
+            <w:r>
+              <w:rPr>
+                <w:rFonts w:ascii="Arial" w:hAnsi="Arial" w:cs="Arial" w:eastAsia="Malgun Gothic"/>
+                <w:b/>
+                <w:i w:val="0"/>
+                <w:sz w:val="20"/>
+              </w:rPr>
+              <w:t>der Triumph, -e</w:t>
+            </w:r>
+            <w:r>
+              <w:rPr>
+                <w:rFonts w:ascii="Malgun Gothic" w:hAnsi="Malgun Gothic" w:cs="Malgun Gothic" w:eastAsia="Malgun Gothic"/>
+                <w:b w:val="0"/>
+                <w:i w:val="0"/>
+                <w:sz w:val="20"/>
+              </w:rPr>
+              <w:t xml:space="preserve">  —  승리</w:t>
+            </w:r>
+          </w:p>
+          <w:p>
+            <w:pPr>
+              <w:spacing w:after="40"/>
+            </w:pPr>
+            <w:r>
+              <w:rPr>
+                <w:rFonts w:ascii="Arial" w:hAnsi="Arial" w:cs="Arial" w:eastAsia="Malgun Gothic"/>
+                <w:b/>
+                <w:i w:val="0"/>
+                <w:sz w:val="20"/>
+              </w:rPr>
+              <w:t>verlieren</w:t>
+            </w:r>
+            <w:r>
+              <w:rPr>
+                <w:rFonts w:ascii="Malgun Gothic" w:hAnsi="Malgun Gothic" w:cs="Malgun Gothic" w:eastAsia="Malgun Gothic"/>
+                <w:b w:val="0"/>
+                <w:i w:val="0"/>
+                <w:sz w:val="20"/>
+              </w:rPr>
+              <w:t xml:space="preserve">  —  잃다</w:t>
+            </w:r>
+          </w:p>
+          <w:p>
+            <w:pPr>
+              <w:spacing w:after="40"/>
+            </w:pPr>
+            <w:r>
+              <w:rPr>
+                <w:rFonts w:ascii="Arial" w:hAnsi="Arial" w:cs="Arial" w:eastAsia="Malgun Gothic"/>
+                <w:b/>
+                <w:i w:val="0"/>
+                <w:sz w:val="20"/>
+              </w:rPr>
+              <w:t>schlecht</w:t>
+            </w:r>
+            <w:r>
+              <w:rPr>
+                <w:rFonts w:ascii="Malgun Gothic" w:hAnsi="Malgun Gothic" w:cs="Malgun Gothic" w:eastAsia="Malgun Gothic"/>
+                <w:b w:val="0"/>
+                <w:i w:val="0"/>
+                <w:sz w:val="20"/>
+              </w:rPr>
+              <w:t xml:space="preserve">  —  나쁜</w:t>
+            </w:r>
+          </w:p>
+        </w:tc>
+      </w:tr>
+      <w:tr>
+        <w:tc>
+          <w:tcPr>
+            <w:tcW w:type="dxa" w:w="1500"/>
+            <w:tcBorders>
+              <w:top w:val="single" w:color="BFBFBF" w:sz="4"/>
+              <w:left w:val="single" w:color="BFBFBF" w:sz="4"/>
+              <w:bottom w:val="single" w:color="BFBFBF" w:sz="4"/>
+              <w:right w:val="single" w:color="BFBFBF" w:sz="4"/>
+            </w:tcBorders>
+            <w:shd w:fill="DEEAF6" w:color="auto" w:val="clear"/>
+          </w:tcPr>
+          <w:p>
+            <w:r>
+              <w:rPr>
+                <w:rFonts w:ascii="Malgun Gothic" w:hAnsi="Malgun Gothic" w:cs="Malgun Gothic" w:eastAsia="Malgun Gothic"/>
+                <w:b/>
+                <w:i w:val="0"/>
+                <w:color w:val="1F3864"/>
+                <w:sz w:val="20"/>
+              </w:rPr>
+              <w:t>문법</w:t>
+            </w:r>
+          </w:p>
+        </w:tc>
+        <w:tc>
+          <w:tcPr>
+            <w:tcW w:type="dxa" w:w="8138"/>
+            <w:tcBorders>
+              <w:top w:val="single" w:color="BFBFBF" w:sz="4"/>
+              <w:left w:val="single" w:color="BFBFBF" w:sz="4"/>
+              <w:bottom w:val="single" w:color="BFBFBF" w:sz="4"/>
+              <w:right w:val="single" w:color="BFBFBF" w:sz="4"/>
+            </w:tcBorders>
+          </w:tcPr>
+          <w:p>
+            <w:pPr>
+              <w:spacing w:after="40"/>
+            </w:pPr>
+            <w:r>
+              <w:rPr>
+                <w:rFonts w:ascii="Malgun Gothic" w:hAnsi="Malgun Gothic" w:cs="Malgun Gothic" w:eastAsia="Malgun Gothic"/>
+                <w:b w:val="0"/>
+                <w:i w:val="0"/>
+                <w:sz w:val="20"/>
+              </w:rPr>
+              <w:t>Es klingt nach einer Familie, die ihren Vater verliert에서 die는 관계대명사이며 klingen nach + 3격이 쓰입니다. auch wenn er ein schlechter war는 양보절입니다.</w:t>
+            </w:r>
+          </w:p>
+        </w:tc>
+      </w:tr>
+      <w:tr>
+        <w:tc>
+          <w:tcPr>
+            <w:tcW w:type="dxa" w:w="1500"/>
+            <w:tcBorders>
+              <w:top w:val="single" w:color="BFBFBF" w:sz="4"/>
+              <w:left w:val="single" w:color="BFBFBF" w:sz="4"/>
+              <w:bottom w:val="single" w:color="BFBFBF" w:sz="4"/>
+              <w:right w:val="single" w:color="BFBFBF" w:sz="4"/>
+            </w:tcBorders>
+            <w:shd w:fill="DEEAF6" w:color="auto" w:val="clear"/>
+          </w:tcPr>
+          <w:p>
+            <w:r>
+              <w:rPr>
+                <w:rFonts w:ascii="Malgun Gothic" w:hAnsi="Malgun Gothic" w:cs="Malgun Gothic" w:eastAsia="Malgun Gothic"/>
+                <w:b/>
+                <w:i w:val="0"/>
+                <w:color w:val="1F3864"/>
+                <w:sz w:val="20"/>
+              </w:rPr>
+              <w:t>표현</w:t>
+            </w:r>
+          </w:p>
+        </w:tc>
+        <w:tc>
+          <w:tcPr>
+            <w:tcW w:type="dxa" w:w="8138"/>
+            <w:tcBorders>
+              <w:top w:val="single" w:color="BFBFBF" w:sz="4"/>
+              <w:left w:val="single" w:color="BFBFBF" w:sz="4"/>
+              <w:bottom w:val="single" w:color="BFBFBF" w:sz="4"/>
+              <w:right w:val="single" w:color="BFBFBF" w:sz="4"/>
+            </w:tcBorders>
+          </w:tcPr>
+          <w:p>
+            <w:pPr>
+              <w:spacing w:after="40"/>
+            </w:pPr>
+            <w:r>
+              <w:rPr>
+                <w:rFonts w:ascii="Malgun Gothic" w:hAnsi="Malgun Gothic" w:cs="Malgun Gothic" w:eastAsia="Malgun Gothic"/>
+                <w:b w:val="0"/>
+                <w:i w:val="0"/>
+                <w:sz w:val="20"/>
+              </w:rPr>
+              <w:t>ein schlechter는 Vater를 대신하는 형용사 명사화입니다.</w:t>
+            </w:r>
+          </w:p>
+        </w:tc>
+      </w:tr>
+      <w:tr>
+        <w:tc>
+          <w:tcPr>
+            <w:tcW w:type="dxa" w:w="1500"/>
+            <w:tcBorders>
+              <w:top w:val="single" w:color="BFBFBF" w:sz="4"/>
+              <w:left w:val="single" w:color="BFBFBF" w:sz="4"/>
+              <w:bottom w:val="single" w:color="BFBFBF" w:sz="4"/>
+              <w:right w:val="single" w:color="BFBFBF" w:sz="4"/>
+            </w:tcBorders>
+            <w:shd w:fill="DEEAF6" w:color="auto" w:val="clear"/>
+          </w:tcPr>
+          <w:p>
+            <w:r>
+              <w:rPr>
+                <w:rFonts w:ascii="Malgun Gothic" w:hAnsi="Malgun Gothic" w:cs="Malgun Gothic" w:eastAsia="Malgun Gothic"/>
+                <w:b/>
+                <w:i w:val="0"/>
+                <w:color w:val="1F3864"/>
+                <w:sz w:val="20"/>
+              </w:rPr>
+              <w:t>시제</w:t>
+            </w:r>
+          </w:p>
+        </w:tc>
+        <w:tc>
+          <w:tcPr>
+            <w:tcW w:type="dxa" w:w="8138"/>
+            <w:tcBorders>
+              <w:top w:val="single" w:color="BFBFBF" w:sz="4"/>
+              <w:left w:val="single" w:color="BFBFBF" w:sz="4"/>
+              <w:bottom w:val="single" w:color="BFBFBF" w:sz="4"/>
+              <w:right w:val="single" w:color="BFBFBF" w:sz="4"/>
+            </w:tcBorders>
+          </w:tcPr>
+          <w:p>
+            <w:pPr>
+              <w:spacing w:after="40"/>
+            </w:pPr>
+            <w:r>
+              <w:rPr>
+                <w:rFonts w:ascii="Malgun Gothic" w:hAnsi="Malgun Gothic" w:cs="Malgun Gothic" w:eastAsia="Malgun Gothic"/>
+                <w:b w:val="0"/>
+                <w:i w:val="0"/>
+                <w:sz w:val="20"/>
+              </w:rPr>
+              <w:t>klingt, verliert는 현재형이고 war는 과거형입니다.</w:t>
+            </w:r>
+          </w:p>
+        </w:tc>
+      </w:tr>
+    </w:tbl>
+    <w:p>
+      <w:pPr>
+        <w:spacing w:after="0"/>
+      </w:pPr>
+    </w:p>
+    <w:p>
+      <w:pPr>
+        <w:keepNext/>
+        <w:spacing w:before="160"/>
+      </w:pPr>
+      <w:r>
+        <w:rPr>
+          <w:rFonts w:ascii="Arial" w:hAnsi="Arial" w:cs="Arial" w:eastAsia="Malgun Gothic"/>
+          <w:b/>
+          <w:i w:val="0"/>
+          <w:sz w:val="22"/>
+        </w:rPr>
+        <w:t>32. Sophie: So geht es mir auch. Ich habe vier Jahre unter ihm gearbeitet. Ich habe ihn bewundert, gefürchtet, verflucht und manchmal ein wenig geliebt. Alles auf einmal.</w:t>
+      </w:r>
+    </w:p>
+    <w:p>
+      <w:pPr>
+        <w:keepNext/>
+        <w:ind w:left="340"/>
+      </w:pPr>
+      <w:r>
+        <w:rPr>
+          <w:rFonts w:ascii="Malgun Gothic" w:hAnsi="Malgun Gothic" w:cs="Malgun Gothic" w:eastAsia="Malgun Gothic"/>
+          <w:b w:val="0"/>
+          <w:i/>
+          <w:color w:val="404040"/>
+          <w:sz w:val="20"/>
+        </w:rPr>
+        <w:t>나도 그래. 사 년 동안 그의 밑에서 일했어. 존경했고 두려워했고 저주했고 가끔은 조금 사랑하기도 했지. 전부 한꺼번에.</w:t>
+      </w:r>
+    </w:p>
+    <w:tbl>
+      <w:tblPr>
+        <w:tblW w:type="auto" w:w="0"/>
+        <w:tblLayout w:type="fixed"/>
+        <w:tblLook w:firstColumn="1" w:firstRow="1" w:lastColumn="0" w:lastRow="0" w:noHBand="0" w:noVBand="1" w:val="04A0"/>
+      </w:tblPr>
+      <w:tblGrid>
+        <w:gridCol w:w="4819"/>
+        <w:gridCol w:w="4819"/>
+      </w:tblGrid>
+      <w:tr>
+        <w:tc>
+          <w:tcPr>
+            <w:tcW w:type="dxa" w:w="1500"/>
+            <w:tcBorders>
+              <w:top w:val="single" w:color="BFBFBF" w:sz="4"/>
+              <w:left w:val="single" w:color="BFBFBF" w:sz="4"/>
+              <w:bottom w:val="single" w:color="BFBFBF" w:sz="4"/>
+              <w:right w:val="single" w:color="BFBFBF" w:sz="4"/>
+            </w:tcBorders>
+            <w:shd w:fill="DEEAF6" w:color="auto" w:val="clear"/>
+          </w:tcPr>
+          <w:p>
+            <w:r>
+              <w:rPr>
+                <w:rFonts w:ascii="Malgun Gothic" w:hAnsi="Malgun Gothic" w:cs="Malgun Gothic" w:eastAsia="Malgun Gothic"/>
+                <w:b/>
+                <w:i w:val="0"/>
+                <w:color w:val="1F3864"/>
+                <w:sz w:val="20"/>
+              </w:rPr>
+              <w:t>주요 단어</w:t>
+            </w:r>
+          </w:p>
+        </w:tc>
+        <w:tc>
+          <w:tcPr>
+            <w:tcW w:type="dxa" w:w="8138"/>
+            <w:tcBorders>
+              <w:top w:val="single" w:color="BFBFBF" w:sz="4"/>
+              <w:left w:val="single" w:color="BFBFBF" w:sz="4"/>
+              <w:bottom w:val="single" w:color="BFBFBF" w:sz="4"/>
+              <w:right w:val="single" w:color="BFBFBF" w:sz="4"/>
+            </w:tcBorders>
+          </w:tcPr>
+          <w:p>
+            <w:pPr>
+              <w:spacing w:after="40"/>
+            </w:pPr>
+            <w:r>
+              <w:rPr>
+                <w:rFonts w:ascii="Arial" w:hAnsi="Arial" w:cs="Arial" w:eastAsia="Malgun Gothic"/>
+                <w:b/>
+                <w:i w:val="0"/>
+                <w:sz w:val="20"/>
+              </w:rPr>
+              <w:t>bewundern</w:t>
+            </w:r>
+            <w:r>
+              <w:rPr>
+                <w:rFonts w:ascii="Malgun Gothic" w:hAnsi="Malgun Gothic" w:cs="Malgun Gothic" w:eastAsia="Malgun Gothic"/>
+                <w:b w:val="0"/>
+                <w:i w:val="0"/>
+                <w:sz w:val="20"/>
+              </w:rPr>
+              <w:t xml:space="preserve">  —  존경하다</w:t>
+            </w:r>
+          </w:p>
+          <w:p>
+            <w:pPr>
+              <w:spacing w:after="40"/>
+            </w:pPr>
+            <w:r>
+              <w:rPr>
+                <w:rFonts w:ascii="Arial" w:hAnsi="Arial" w:cs="Arial" w:eastAsia="Malgun Gothic"/>
+                <w:b/>
+                <w:i w:val="0"/>
+                <w:sz w:val="20"/>
+              </w:rPr>
+              <w:t>fürchten</w:t>
+            </w:r>
+            <w:r>
+              <w:rPr>
+                <w:rFonts w:ascii="Malgun Gothic" w:hAnsi="Malgun Gothic" w:cs="Malgun Gothic" w:eastAsia="Malgun Gothic"/>
+                <w:b w:val="0"/>
+                <w:i w:val="0"/>
+                <w:sz w:val="20"/>
+              </w:rPr>
+              <w:t xml:space="preserve">  —  두려워하다</w:t>
+            </w:r>
+          </w:p>
+          <w:p>
+            <w:pPr>
+              <w:spacing w:after="40"/>
+            </w:pPr>
+            <w:r>
+              <w:rPr>
+                <w:rFonts w:ascii="Arial" w:hAnsi="Arial" w:cs="Arial" w:eastAsia="Malgun Gothic"/>
+                <w:b/>
+                <w:i w:val="0"/>
+                <w:sz w:val="20"/>
+              </w:rPr>
+              <w:t>verfluchen</w:t>
+            </w:r>
+            <w:r>
+              <w:rPr>
+                <w:rFonts w:ascii="Malgun Gothic" w:hAnsi="Malgun Gothic" w:cs="Malgun Gothic" w:eastAsia="Malgun Gothic"/>
+                <w:b w:val="0"/>
+                <w:i w:val="0"/>
+                <w:sz w:val="20"/>
+              </w:rPr>
+              <w:t xml:space="preserve">  —  저주하다</w:t>
+            </w:r>
+          </w:p>
+        </w:tc>
+      </w:tr>
+      <w:tr>
+        <w:tc>
+          <w:tcPr>
+            <w:tcW w:type="dxa" w:w="1500"/>
+            <w:tcBorders>
+              <w:top w:val="single" w:color="BFBFBF" w:sz="4"/>
+              <w:left w:val="single" w:color="BFBFBF" w:sz="4"/>
+              <w:bottom w:val="single" w:color="BFBFBF" w:sz="4"/>
+              <w:right w:val="single" w:color="BFBFBF" w:sz="4"/>
+            </w:tcBorders>
+            <w:shd w:fill="DEEAF6" w:color="auto" w:val="clear"/>
+          </w:tcPr>
+          <w:p>
+            <w:r>
+              <w:rPr>
+                <w:rFonts w:ascii="Malgun Gothic" w:hAnsi="Malgun Gothic" w:cs="Malgun Gothic" w:eastAsia="Malgun Gothic"/>
+                <w:b/>
+                <w:i w:val="0"/>
+                <w:color w:val="1F3864"/>
+                <w:sz w:val="20"/>
+              </w:rPr>
+              <w:t>문법</w:t>
+            </w:r>
+          </w:p>
+        </w:tc>
+        <w:tc>
+          <w:tcPr>
+            <w:tcW w:type="dxa" w:w="8138"/>
+            <w:tcBorders>
+              <w:top w:val="single" w:color="BFBFBF" w:sz="4"/>
+              <w:left w:val="single" w:color="BFBFBF" w:sz="4"/>
+              <w:bottom w:val="single" w:color="BFBFBF" w:sz="4"/>
+              <w:right w:val="single" w:color="BFBFBF" w:sz="4"/>
+            </w:tcBorders>
+          </w:tcPr>
+          <w:p>
+            <w:pPr>
+              <w:spacing w:after="40"/>
+            </w:pPr>
+            <w:r>
+              <w:rPr>
+                <w:rFonts w:ascii="Malgun Gothic" w:hAnsi="Malgun Gothic" w:cs="Malgun Gothic" w:eastAsia="Malgun Gothic"/>
+                <w:b w:val="0"/>
+                <w:i w:val="0"/>
+                <w:sz w:val="20"/>
+              </w:rPr>
+              <w:t>So geht es mir auch에서 gehen은 3격 mir를 취합니다. Ich habe ihn bewundert, gefürchtet, verflucht und ... geliebt는 현재완료의 병렬입니다.</w:t>
+            </w:r>
+          </w:p>
+        </w:tc>
+      </w:tr>
+      <w:tr>
+        <w:tc>
+          <w:tcPr>
+            <w:tcW w:type="dxa" w:w="1500"/>
+            <w:tcBorders>
+              <w:top w:val="single" w:color="BFBFBF" w:sz="4"/>
+              <w:left w:val="single" w:color="BFBFBF" w:sz="4"/>
+              <w:bottom w:val="single" w:color="BFBFBF" w:sz="4"/>
+              <w:right w:val="single" w:color="BFBFBF" w:sz="4"/>
+            </w:tcBorders>
+            <w:shd w:fill="DEEAF6" w:color="auto" w:val="clear"/>
+          </w:tcPr>
+          <w:p>
+            <w:r>
+              <w:rPr>
+                <w:rFonts w:ascii="Malgun Gothic" w:hAnsi="Malgun Gothic" w:cs="Malgun Gothic" w:eastAsia="Malgun Gothic"/>
+                <w:b/>
+                <w:i w:val="0"/>
+                <w:color w:val="1F3864"/>
+                <w:sz w:val="20"/>
+              </w:rPr>
+              <w:t>표현</w:t>
+            </w:r>
+          </w:p>
+        </w:tc>
+        <w:tc>
+          <w:tcPr>
+            <w:tcW w:type="dxa" w:w="8138"/>
+            <w:tcBorders>
+              <w:top w:val="single" w:color="BFBFBF" w:sz="4"/>
+              <w:left w:val="single" w:color="BFBFBF" w:sz="4"/>
+              <w:bottom w:val="single" w:color="BFBFBF" w:sz="4"/>
+              <w:right w:val="single" w:color="BFBFBF" w:sz="4"/>
+            </w:tcBorders>
+          </w:tcPr>
+          <w:p>
+            <w:pPr>
+              <w:spacing w:after="40"/>
+            </w:pPr>
+            <w:r>
+              <w:rPr>
+                <w:rFonts w:ascii="Malgun Gothic" w:hAnsi="Malgun Gothic" w:cs="Malgun Gothic" w:eastAsia="Malgun Gothic"/>
+                <w:b w:val="0"/>
+                <w:i w:val="0"/>
+                <w:sz w:val="20"/>
+              </w:rPr>
+              <w:t>Alles auf einmal은 전부 한꺼번에라는 표현입니다.</w:t>
+            </w:r>
+          </w:p>
+        </w:tc>
+      </w:tr>
+      <w:tr>
+        <w:tc>
+          <w:tcPr>
+            <w:tcW w:type="dxa" w:w="1500"/>
+            <w:tcBorders>
+              <w:top w:val="single" w:color="BFBFBF" w:sz="4"/>
+              <w:left w:val="single" w:color="BFBFBF" w:sz="4"/>
+              <w:bottom w:val="single" w:color="BFBFBF" w:sz="4"/>
+              <w:right w:val="single" w:color="BFBFBF" w:sz="4"/>
+            </w:tcBorders>
+            <w:shd w:fill="DEEAF6" w:color="auto" w:val="clear"/>
+          </w:tcPr>
+          <w:p>
+            <w:r>
+              <w:rPr>
+                <w:rFonts w:ascii="Malgun Gothic" w:hAnsi="Malgun Gothic" w:cs="Malgun Gothic" w:eastAsia="Malgun Gothic"/>
+                <w:b/>
+                <w:i w:val="0"/>
+                <w:color w:val="1F3864"/>
+                <w:sz w:val="20"/>
+              </w:rPr>
+              <w:t>시제</w:t>
+            </w:r>
+          </w:p>
+        </w:tc>
+        <w:tc>
+          <w:tcPr>
+            <w:tcW w:type="dxa" w:w="8138"/>
+            <w:tcBorders>
+              <w:top w:val="single" w:color="BFBFBF" w:sz="4"/>
+              <w:left w:val="single" w:color="BFBFBF" w:sz="4"/>
+              <w:bottom w:val="single" w:color="BFBFBF" w:sz="4"/>
+              <w:right w:val="single" w:color="BFBFBF" w:sz="4"/>
+            </w:tcBorders>
+          </w:tcPr>
+          <w:p>
+            <w:pPr>
+              <w:spacing w:after="40"/>
+            </w:pPr>
+            <w:r>
+              <w:rPr>
+                <w:rFonts w:ascii="Malgun Gothic" w:hAnsi="Malgun Gothic" w:cs="Malgun Gothic" w:eastAsia="Malgun Gothic"/>
+                <w:b w:val="0"/>
+                <w:i w:val="0"/>
+                <w:sz w:val="20"/>
+              </w:rPr>
+              <w:t>geht는 현재형이고 habe ... gearbeitet, ... bewundert 등은 현재완료입니다.</w:t>
+            </w:r>
+          </w:p>
+        </w:tc>
+      </w:tr>
+    </w:tbl>
+    <w:p>
+      <w:pPr>
+        <w:spacing w:after="0"/>
+      </w:pPr>
+    </w:p>
+    <w:p>
+      <w:pPr>
+        <w:keepNext/>
+        <w:spacing w:before="160"/>
+      </w:pPr>
+      <w:r>
+        <w:rPr>
+          <w:rFonts w:ascii="Arial" w:hAnsi="Arial" w:cs="Arial" w:eastAsia="Malgun Gothic"/>
+          <w:b/>
+          <w:i w:val="0"/>
+          <w:sz w:val="22"/>
+        </w:rPr>
+        <w:t>33. Jonas: Das ist ehrlich. Und es erinnert mich an Hannas Satz: Man muss nicht hassen, um zu kämpfen. Nur Klarheit haben darüber, was richtig ist.</w:t>
+      </w:r>
+    </w:p>
+    <w:p>
+      <w:pPr>
+        <w:keepNext/>
+        <w:ind w:left="340"/>
+      </w:pPr>
+      <w:r>
+        <w:rPr>
+          <w:rFonts w:ascii="Malgun Gothic" w:hAnsi="Malgun Gothic" w:cs="Malgun Gothic" w:eastAsia="Malgun Gothic"/>
+          <w:b w:val="0"/>
+          <w:i/>
+          <w:color w:val="404040"/>
+          <w:sz w:val="20"/>
+        </w:rPr>
+        <w:t>솔직하네. 그리고 한나의 말이 떠올라. 싸우려고 미워할 필요는 없다는 것. 무엇이 옳은지 분명히 알기만 하면 된다는 것.</w:t>
+      </w:r>
+    </w:p>
+    <w:tbl>
+      <w:tblPr>
+        <w:tblW w:type="auto" w:w="0"/>
+        <w:tblLayout w:type="fixed"/>
+        <w:tblLook w:firstColumn="1" w:firstRow="1" w:lastColumn="0" w:lastRow="0" w:noHBand="0" w:noVBand="1" w:val="04A0"/>
+      </w:tblPr>
+      <w:tblGrid>
+        <w:gridCol w:w="4819"/>
+        <w:gridCol w:w="4819"/>
+      </w:tblGrid>
+      <w:tr>
+        <w:tc>
+          <w:tcPr>
+            <w:tcW w:type="dxa" w:w="1500"/>
+            <w:tcBorders>
+              <w:top w:val="single" w:color="BFBFBF" w:sz="4"/>
+              <w:left w:val="single" w:color="BFBFBF" w:sz="4"/>
+              <w:bottom w:val="single" w:color="BFBFBF" w:sz="4"/>
+              <w:right w:val="single" w:color="BFBFBF" w:sz="4"/>
+            </w:tcBorders>
+            <w:shd w:fill="DEEAF6" w:color="auto" w:val="clear"/>
+          </w:tcPr>
+          <w:p>
+            <w:r>
+              <w:rPr>
+                <w:rFonts w:ascii="Malgun Gothic" w:hAnsi="Malgun Gothic" w:cs="Malgun Gothic" w:eastAsia="Malgun Gothic"/>
+                <w:b/>
+                <w:i w:val="0"/>
+                <w:color w:val="1F3864"/>
+                <w:sz w:val="20"/>
+              </w:rPr>
+              <w:t>주요 단어</w:t>
+            </w:r>
+          </w:p>
+        </w:tc>
+        <w:tc>
+          <w:tcPr>
+            <w:tcW w:type="dxa" w:w="8138"/>
+            <w:tcBorders>
+              <w:top w:val="single" w:color="BFBFBF" w:sz="4"/>
+              <w:left w:val="single" w:color="BFBFBF" w:sz="4"/>
+              <w:bottom w:val="single" w:color="BFBFBF" w:sz="4"/>
+              <w:right w:val="single" w:color="BFBFBF" w:sz="4"/>
+            </w:tcBorders>
+          </w:tcPr>
+          <w:p>
+            <w:pPr>
+              <w:spacing w:after="40"/>
+            </w:pPr>
+            <w:r>
+              <w:rPr>
+                <w:rFonts w:ascii="Arial" w:hAnsi="Arial" w:cs="Arial" w:eastAsia="Malgun Gothic"/>
+                <w:b/>
+                <w:i w:val="0"/>
+                <w:sz w:val="20"/>
+              </w:rPr>
+              <w:t>hassen</w:t>
+            </w:r>
+            <w:r>
+              <w:rPr>
+                <w:rFonts w:ascii="Malgun Gothic" w:hAnsi="Malgun Gothic" w:cs="Malgun Gothic" w:eastAsia="Malgun Gothic"/>
+                <w:b w:val="0"/>
+                <w:i w:val="0"/>
+                <w:sz w:val="20"/>
+              </w:rPr>
+              <w:t xml:space="preserve">  —  미워하다</w:t>
+            </w:r>
+          </w:p>
+          <w:p>
+            <w:pPr>
+              <w:spacing w:after="40"/>
+            </w:pPr>
+            <w:r>
+              <w:rPr>
+                <w:rFonts w:ascii="Arial" w:hAnsi="Arial" w:cs="Arial" w:eastAsia="Malgun Gothic"/>
+                <w:b/>
+                <w:i w:val="0"/>
+                <w:sz w:val="20"/>
+              </w:rPr>
+              <w:t>kämpfen</w:t>
+            </w:r>
+            <w:r>
+              <w:rPr>
+                <w:rFonts w:ascii="Malgun Gothic" w:hAnsi="Malgun Gothic" w:cs="Malgun Gothic" w:eastAsia="Malgun Gothic"/>
+                <w:b w:val="0"/>
+                <w:i w:val="0"/>
+                <w:sz w:val="20"/>
+              </w:rPr>
+              <w:t xml:space="preserve">  —  싸우다</w:t>
+            </w:r>
+          </w:p>
+          <w:p>
+            <w:pPr>
+              <w:spacing w:after="40"/>
+            </w:pPr>
+            <w:r>
+              <w:rPr>
+                <w:rFonts w:ascii="Arial" w:hAnsi="Arial" w:cs="Arial" w:eastAsia="Malgun Gothic"/>
+                <w:b/>
+                <w:i w:val="0"/>
+                <w:sz w:val="20"/>
+              </w:rPr>
+              <w:t>die Klarheit (단수)</w:t>
+            </w:r>
+            <w:r>
+              <w:rPr>
+                <w:rFonts w:ascii="Malgun Gothic" w:hAnsi="Malgun Gothic" w:cs="Malgun Gothic" w:eastAsia="Malgun Gothic"/>
+                <w:b w:val="0"/>
+                <w:i w:val="0"/>
+                <w:sz w:val="20"/>
+              </w:rPr>
+              <w:t xml:space="preserve">  —  명료함</w:t>
+            </w:r>
+          </w:p>
+        </w:tc>
+      </w:tr>
+      <w:tr>
+        <w:tc>
+          <w:tcPr>
+            <w:tcW w:type="dxa" w:w="1500"/>
+            <w:tcBorders>
+              <w:top w:val="single" w:color="BFBFBF" w:sz="4"/>
+              <w:left w:val="single" w:color="BFBFBF" w:sz="4"/>
+              <w:bottom w:val="single" w:color="BFBFBF" w:sz="4"/>
+              <w:right w:val="single" w:color="BFBFBF" w:sz="4"/>
+            </w:tcBorders>
+            <w:shd w:fill="DEEAF6" w:color="auto" w:val="clear"/>
+          </w:tcPr>
+          <w:p>
+            <w:r>
+              <w:rPr>
+                <w:rFonts w:ascii="Malgun Gothic" w:hAnsi="Malgun Gothic" w:cs="Malgun Gothic" w:eastAsia="Malgun Gothic"/>
+                <w:b/>
+                <w:i w:val="0"/>
+                <w:color w:val="1F3864"/>
+                <w:sz w:val="20"/>
+              </w:rPr>
+              <w:t>문법</w:t>
+            </w:r>
+          </w:p>
+        </w:tc>
+        <w:tc>
+          <w:tcPr>
+            <w:tcW w:type="dxa" w:w="8138"/>
+            <w:tcBorders>
+              <w:top w:val="single" w:color="BFBFBF" w:sz="4"/>
+              <w:left w:val="single" w:color="BFBFBF" w:sz="4"/>
+              <w:bottom w:val="single" w:color="BFBFBF" w:sz="4"/>
+              <w:right w:val="single" w:color="BFBFBF" w:sz="4"/>
+            </w:tcBorders>
+          </w:tcPr>
+          <w:p>
+            <w:pPr>
+              <w:spacing w:after="40"/>
+            </w:pPr>
+            <w:r>
+              <w:rPr>
+                <w:rFonts w:ascii="Malgun Gothic" w:hAnsi="Malgun Gothic" w:cs="Malgun Gothic" w:eastAsia="Malgun Gothic"/>
+                <w:b w:val="0"/>
+                <w:i w:val="0"/>
+                <w:sz w:val="20"/>
+              </w:rPr>
+              <w:t>Man muss nicht hassen, um zu kämpfen에서 um ... zu + 부정형이 목적을 나타냅니다. Nur Klarheit haben darüber, was richtig ist에서 darüber가 was절을 예고합니다.</w:t>
+            </w:r>
+          </w:p>
+        </w:tc>
+      </w:tr>
+      <w:tr>
+        <w:tc>
+          <w:tcPr>
+            <w:tcW w:type="dxa" w:w="1500"/>
+            <w:tcBorders>
+              <w:top w:val="single" w:color="BFBFBF" w:sz="4"/>
+              <w:left w:val="single" w:color="BFBFBF" w:sz="4"/>
+              <w:bottom w:val="single" w:color="BFBFBF" w:sz="4"/>
+              <w:right w:val="single" w:color="BFBFBF" w:sz="4"/>
+            </w:tcBorders>
+            <w:shd w:fill="DEEAF6" w:color="auto" w:val="clear"/>
+          </w:tcPr>
+          <w:p>
+            <w:r>
+              <w:rPr>
+                <w:rFonts w:ascii="Malgun Gothic" w:hAnsi="Malgun Gothic" w:cs="Malgun Gothic" w:eastAsia="Malgun Gothic"/>
+                <w:b/>
+                <w:i w:val="0"/>
+                <w:color w:val="1F3864"/>
+                <w:sz w:val="20"/>
+              </w:rPr>
+              <w:t>표현</w:t>
+            </w:r>
+          </w:p>
+        </w:tc>
+        <w:tc>
+          <w:tcPr>
+            <w:tcW w:type="dxa" w:w="8138"/>
+            <w:tcBorders>
+              <w:top w:val="single" w:color="BFBFBF" w:sz="4"/>
+              <w:left w:val="single" w:color="BFBFBF" w:sz="4"/>
+              <w:bottom w:val="single" w:color="BFBFBF" w:sz="4"/>
+              <w:right w:val="single" w:color="BFBFBF" w:sz="4"/>
+            </w:tcBorders>
+          </w:tcPr>
+          <w:p>
+            <w:pPr>
+              <w:spacing w:after="40"/>
+            </w:pPr>
+            <w:r>
+              <w:rPr>
+                <w:rFonts w:ascii="Malgun Gothic" w:hAnsi="Malgun Gothic" w:cs="Malgun Gothic" w:eastAsia="Malgun Gothic"/>
+                <w:b w:val="0"/>
+                <w:i w:val="0"/>
+                <w:sz w:val="20"/>
+              </w:rPr>
+              <w:t>erinnern an + 4격이 쓰입니다.</w:t>
+            </w:r>
+          </w:p>
+        </w:tc>
+      </w:tr>
+      <w:tr>
+        <w:tc>
+          <w:tcPr>
+            <w:tcW w:type="dxa" w:w="1500"/>
+            <w:tcBorders>
+              <w:top w:val="single" w:color="BFBFBF" w:sz="4"/>
+              <w:left w:val="single" w:color="BFBFBF" w:sz="4"/>
+              <w:bottom w:val="single" w:color="BFBFBF" w:sz="4"/>
+              <w:right w:val="single" w:color="BFBFBF" w:sz="4"/>
+            </w:tcBorders>
+            <w:shd w:fill="DEEAF6" w:color="auto" w:val="clear"/>
+          </w:tcPr>
+          <w:p>
+            <w:r>
+              <w:rPr>
+                <w:rFonts w:ascii="Malgun Gothic" w:hAnsi="Malgun Gothic" w:cs="Malgun Gothic" w:eastAsia="Malgun Gothic"/>
+                <w:b/>
+                <w:i w:val="0"/>
+                <w:color w:val="1F3864"/>
+                <w:sz w:val="20"/>
+              </w:rPr>
+              <w:t>시제</w:t>
+            </w:r>
+          </w:p>
+        </w:tc>
+        <w:tc>
+          <w:tcPr>
+            <w:tcW w:type="dxa" w:w="8138"/>
+            <w:tcBorders>
+              <w:top w:val="single" w:color="BFBFBF" w:sz="4"/>
+              <w:left w:val="single" w:color="BFBFBF" w:sz="4"/>
+              <w:bottom w:val="single" w:color="BFBFBF" w:sz="4"/>
+              <w:right w:val="single" w:color="BFBFBF" w:sz="4"/>
+            </w:tcBorders>
+          </w:tcPr>
+          <w:p>
+            <w:pPr>
+              <w:spacing w:after="40"/>
+            </w:pPr>
+            <w:r>
+              <w:rPr>
+                <w:rFonts w:ascii="Malgun Gothic" w:hAnsi="Malgun Gothic" w:cs="Malgun Gothic" w:eastAsia="Malgun Gothic"/>
+                <w:b w:val="0"/>
+                <w:i w:val="0"/>
+                <w:sz w:val="20"/>
+              </w:rPr>
+              <w:t>ist, erinnert, muss, ist는 현재형입니다.</w:t>
+            </w:r>
+          </w:p>
+        </w:tc>
+      </w:tr>
+    </w:tbl>
+    <w:p>
+      <w:pPr>
+        <w:spacing w:after="0"/>
+      </w:pPr>
+    </w:p>
+    <w:p>
+      <w:pPr>
+        <w:keepNext/>
+        <w:spacing w:before="160"/>
+      </w:pPr>
+      <w:r>
+        <w:rPr>
+          <w:rFonts w:ascii="Arial" w:hAnsi="Arial" w:cs="Arial" w:eastAsia="Malgun Gothic"/>
+          <w:b/>
+          <w:i w:val="0"/>
+          <w:sz w:val="22"/>
+        </w:rPr>
+        <w:t>34. Sophie: Danke, dass du das sagst. Ich habe das Gefühl, ich muss mich für meinen Mitleid entschuldigen. Aber vielleicht ist Mitleid auch nur eine andere Form von Klarheit.</w:t>
+      </w:r>
+    </w:p>
+    <w:p>
+      <w:pPr>
+        <w:keepNext/>
+        <w:ind w:left="340"/>
+      </w:pPr>
+      <w:r>
+        <w:rPr>
+          <w:rFonts w:ascii="Malgun Gothic" w:hAnsi="Malgun Gothic" w:cs="Malgun Gothic" w:eastAsia="Malgun Gothic"/>
+          <w:b w:val="0"/>
+          <w:i/>
+          <w:color w:val="404040"/>
+          <w:sz w:val="20"/>
+        </w:rPr>
+        <w:t>그렇게 말해 줘서 고마워. 내 연민에 대해 사과해야 할 것 같은 기분이었어. 하지만 연민도 명료함의 다른 형태일지 몰라.</w:t>
+      </w:r>
+    </w:p>
+    <w:tbl>
+      <w:tblPr>
+        <w:tblW w:type="auto" w:w="0"/>
+        <w:tblLayout w:type="fixed"/>
+        <w:tblLook w:firstColumn="1" w:firstRow="1" w:lastColumn="0" w:lastRow="0" w:noHBand="0" w:noVBand="1" w:val="04A0"/>
+      </w:tblPr>
+      <w:tblGrid>
+        <w:gridCol w:w="4819"/>
+        <w:gridCol w:w="4819"/>
+      </w:tblGrid>
+      <w:tr>
+        <w:tc>
+          <w:tcPr>
+            <w:tcW w:type="dxa" w:w="1500"/>
+            <w:tcBorders>
+              <w:top w:val="single" w:color="BFBFBF" w:sz="4"/>
+              <w:left w:val="single" w:color="BFBFBF" w:sz="4"/>
+              <w:bottom w:val="single" w:color="BFBFBF" w:sz="4"/>
+              <w:right w:val="single" w:color="BFBFBF" w:sz="4"/>
+            </w:tcBorders>
+            <w:shd w:fill="DEEAF6" w:color="auto" w:val="clear"/>
+          </w:tcPr>
+          <w:p>
+            <w:r>
+              <w:rPr>
+                <w:rFonts w:ascii="Malgun Gothic" w:hAnsi="Malgun Gothic" w:cs="Malgun Gothic" w:eastAsia="Malgun Gothic"/>
+                <w:b/>
+                <w:i w:val="0"/>
+                <w:color w:val="1F3864"/>
+                <w:sz w:val="20"/>
+              </w:rPr>
+              <w:t>주요 단어</w:t>
+            </w:r>
+          </w:p>
+        </w:tc>
+        <w:tc>
+          <w:tcPr>
+            <w:tcW w:type="dxa" w:w="8138"/>
+            <w:tcBorders>
+              <w:top w:val="single" w:color="BFBFBF" w:sz="4"/>
+              <w:left w:val="single" w:color="BFBFBF" w:sz="4"/>
+              <w:bottom w:val="single" w:color="BFBFBF" w:sz="4"/>
+              <w:right w:val="single" w:color="BFBFBF" w:sz="4"/>
+            </w:tcBorders>
+          </w:tcPr>
+          <w:p>
+            <w:pPr>
+              <w:spacing w:after="40"/>
+            </w:pPr>
+            <w:r>
+              <w:rPr>
+                <w:rFonts w:ascii="Arial" w:hAnsi="Arial" w:cs="Arial" w:eastAsia="Malgun Gothic"/>
+                <w:b/>
+                <w:i w:val="0"/>
+                <w:sz w:val="20"/>
+              </w:rPr>
+              <w:t>das Mitleid (단수)</w:t>
+            </w:r>
+            <w:r>
+              <w:rPr>
+                <w:rFonts w:ascii="Malgun Gothic" w:hAnsi="Malgun Gothic" w:cs="Malgun Gothic" w:eastAsia="Malgun Gothic"/>
+                <w:b w:val="0"/>
+                <w:i w:val="0"/>
+                <w:sz w:val="20"/>
+              </w:rPr>
+              <w:t xml:space="preserve">  —  연민</w:t>
+            </w:r>
+          </w:p>
+          <w:p>
+            <w:pPr>
+              <w:spacing w:after="40"/>
+            </w:pPr>
+            <w:r>
+              <w:rPr>
+                <w:rFonts w:ascii="Arial" w:hAnsi="Arial" w:cs="Arial" w:eastAsia="Malgun Gothic"/>
+                <w:b/>
+                <w:i w:val="0"/>
+                <w:sz w:val="20"/>
+              </w:rPr>
+              <w:t>sich entschuldigen</w:t>
+            </w:r>
+            <w:r>
+              <w:rPr>
+                <w:rFonts w:ascii="Malgun Gothic" w:hAnsi="Malgun Gothic" w:cs="Malgun Gothic" w:eastAsia="Malgun Gothic"/>
+                <w:b w:val="0"/>
+                <w:i w:val="0"/>
+                <w:sz w:val="20"/>
+              </w:rPr>
+              <w:t xml:space="preserve">  —  사과하다</w:t>
+            </w:r>
+          </w:p>
+          <w:p>
+            <w:pPr>
+              <w:spacing w:after="40"/>
+            </w:pPr>
+            <w:r>
+              <w:rPr>
+                <w:rFonts w:ascii="Arial" w:hAnsi="Arial" w:cs="Arial" w:eastAsia="Malgun Gothic"/>
+                <w:b/>
+                <w:i w:val="0"/>
+                <w:sz w:val="20"/>
+              </w:rPr>
+              <w:t>die Form, -en</w:t>
+            </w:r>
+            <w:r>
+              <w:rPr>
+                <w:rFonts w:ascii="Malgun Gothic" w:hAnsi="Malgun Gothic" w:cs="Malgun Gothic" w:eastAsia="Malgun Gothic"/>
+                <w:b w:val="0"/>
+                <w:i w:val="0"/>
+                <w:sz w:val="20"/>
+              </w:rPr>
+              <w:t xml:space="preserve">  —  형태</w:t>
+            </w:r>
+          </w:p>
+        </w:tc>
+      </w:tr>
+      <w:tr>
+        <w:tc>
+          <w:tcPr>
+            <w:tcW w:type="dxa" w:w="1500"/>
+            <w:tcBorders>
+              <w:top w:val="single" w:color="BFBFBF" w:sz="4"/>
+              <w:left w:val="single" w:color="BFBFBF" w:sz="4"/>
+              <w:bottom w:val="single" w:color="BFBFBF" w:sz="4"/>
+              <w:right w:val="single" w:color="BFBFBF" w:sz="4"/>
+            </w:tcBorders>
+            <w:shd w:fill="DEEAF6" w:color="auto" w:val="clear"/>
+          </w:tcPr>
+          <w:p>
+            <w:r>
+              <w:rPr>
+                <w:rFonts w:ascii="Malgun Gothic" w:hAnsi="Malgun Gothic" w:cs="Malgun Gothic" w:eastAsia="Malgun Gothic"/>
+                <w:b/>
+                <w:i w:val="0"/>
+                <w:color w:val="1F3864"/>
+                <w:sz w:val="20"/>
+              </w:rPr>
+              <w:t>문법</w:t>
+            </w:r>
+          </w:p>
+        </w:tc>
+        <w:tc>
+          <w:tcPr>
+            <w:tcW w:type="dxa" w:w="8138"/>
+            <w:tcBorders>
+              <w:top w:val="single" w:color="BFBFBF" w:sz="4"/>
+              <w:left w:val="single" w:color="BFBFBF" w:sz="4"/>
+              <w:bottom w:val="single" w:color="BFBFBF" w:sz="4"/>
+              <w:right w:val="single" w:color="BFBFBF" w:sz="4"/>
+            </w:tcBorders>
+          </w:tcPr>
+          <w:p>
+            <w:pPr>
+              <w:spacing w:after="40"/>
+            </w:pPr>
+            <w:r>
+              <w:rPr>
+                <w:rFonts w:ascii="Malgun Gothic" w:hAnsi="Malgun Gothic" w:cs="Malgun Gothic" w:eastAsia="Malgun Gothic"/>
+                <w:b w:val="0"/>
+                <w:i w:val="0"/>
+                <w:sz w:val="20"/>
+              </w:rPr>
+              <w:t>Danke, dass du das sagst에서 dass절의 sagst가 끝에 옵니다. Ich habe das Gefühl, ich muss ...에서 dass가 생략되었습니다.</w:t>
+            </w:r>
+          </w:p>
+        </w:tc>
+      </w:tr>
+      <w:tr>
+        <w:tc>
+          <w:tcPr>
+            <w:tcW w:type="dxa" w:w="1500"/>
+            <w:tcBorders>
+              <w:top w:val="single" w:color="BFBFBF" w:sz="4"/>
+              <w:left w:val="single" w:color="BFBFBF" w:sz="4"/>
+              <w:bottom w:val="single" w:color="BFBFBF" w:sz="4"/>
+              <w:right w:val="single" w:color="BFBFBF" w:sz="4"/>
+            </w:tcBorders>
+            <w:shd w:fill="DEEAF6" w:color="auto" w:val="clear"/>
+          </w:tcPr>
+          <w:p>
+            <w:r>
+              <w:rPr>
+                <w:rFonts w:ascii="Malgun Gothic" w:hAnsi="Malgun Gothic" w:cs="Malgun Gothic" w:eastAsia="Malgun Gothic"/>
+                <w:b/>
+                <w:i w:val="0"/>
+                <w:color w:val="1F3864"/>
+                <w:sz w:val="20"/>
+              </w:rPr>
+              <w:t>표현</w:t>
+            </w:r>
+          </w:p>
+        </w:tc>
+        <w:tc>
+          <w:tcPr>
+            <w:tcW w:type="dxa" w:w="8138"/>
+            <w:tcBorders>
+              <w:top w:val="single" w:color="BFBFBF" w:sz="4"/>
+              <w:left w:val="single" w:color="BFBFBF" w:sz="4"/>
+              <w:bottom w:val="single" w:color="BFBFBF" w:sz="4"/>
+              <w:right w:val="single" w:color="BFBFBF" w:sz="4"/>
+            </w:tcBorders>
+          </w:tcPr>
+          <w:p>
+            <w:pPr>
+              <w:spacing w:after="40"/>
+            </w:pPr>
+            <w:r>
+              <w:rPr>
+                <w:rFonts w:ascii="Malgun Gothic" w:hAnsi="Malgun Gothic" w:cs="Malgun Gothic" w:eastAsia="Malgun Gothic"/>
+                <w:b w:val="0"/>
+                <w:i w:val="0"/>
+                <w:sz w:val="20"/>
+              </w:rPr>
+              <w:t>vielleicht는 가능성을 나타내는 부사입니다.</w:t>
+            </w:r>
+          </w:p>
+        </w:tc>
+      </w:tr>
+      <w:tr>
+        <w:tc>
+          <w:tcPr>
+            <w:tcW w:type="dxa" w:w="1500"/>
+            <w:tcBorders>
+              <w:top w:val="single" w:color="BFBFBF" w:sz="4"/>
+              <w:left w:val="single" w:color="BFBFBF" w:sz="4"/>
+              <w:bottom w:val="single" w:color="BFBFBF" w:sz="4"/>
+              <w:right w:val="single" w:color="BFBFBF" w:sz="4"/>
+            </w:tcBorders>
+            <w:shd w:fill="DEEAF6" w:color="auto" w:val="clear"/>
+          </w:tcPr>
+          <w:p>
+            <w:r>
+              <w:rPr>
+                <w:rFonts w:ascii="Malgun Gothic" w:hAnsi="Malgun Gothic" w:cs="Malgun Gothic" w:eastAsia="Malgun Gothic"/>
+                <w:b/>
+                <w:i w:val="0"/>
+                <w:color w:val="1F3864"/>
+                <w:sz w:val="20"/>
+              </w:rPr>
+              <w:t>시제</w:t>
+            </w:r>
+          </w:p>
+        </w:tc>
+        <w:tc>
+          <w:tcPr>
+            <w:tcW w:type="dxa" w:w="8138"/>
+            <w:tcBorders>
+              <w:top w:val="single" w:color="BFBFBF" w:sz="4"/>
+              <w:left w:val="single" w:color="BFBFBF" w:sz="4"/>
+              <w:bottom w:val="single" w:color="BFBFBF" w:sz="4"/>
+              <w:right w:val="single" w:color="BFBFBF" w:sz="4"/>
+            </w:tcBorders>
+          </w:tcPr>
+          <w:p>
+            <w:pPr>
+              <w:spacing w:after="40"/>
+            </w:pPr>
+            <w:r>
+              <w:rPr>
+                <w:rFonts w:ascii="Malgun Gothic" w:hAnsi="Malgun Gothic" w:cs="Malgun Gothic" w:eastAsia="Malgun Gothic"/>
+                <w:b w:val="0"/>
+                <w:i w:val="0"/>
+                <w:sz w:val="20"/>
+              </w:rPr>
+              <w:t>habe, muss, ist는 현재형입니다.</w:t>
+            </w:r>
+          </w:p>
+        </w:tc>
+      </w:tr>
+    </w:tbl>
+    <w:p>
+      <w:pPr>
+        <w:spacing w:after="0"/>
+      </w:pPr>
+    </w:p>
+    <w:p>
+      <w:pPr>
+        <w:keepNext/>
+        <w:spacing w:before="160"/>
+      </w:pPr>
+      <w:r>
+        <w:rPr>
+          <w:rFonts w:ascii="Arial" w:hAnsi="Arial" w:cs="Arial" w:eastAsia="Malgun Gothic"/>
+          <w:b/>
+          <w:i w:val="0"/>
+          <w:sz w:val="22"/>
+        </w:rPr>
+        <w:t>35. Jonas: Am Mittag erreicht mich eine kurze Nachricht von Dietrich: „Sie haben heute Nacht bei mir geklingelt. Kein Durchsuchungsbeschluss, nur zwei freundliche Beamte, die mir eine Zeugenladung brachten. Claudia hat Kaffee gekocht."</w:t>
       </w:r>
     </w:p>
     <w:p>
@@ -7385,7 +10751,7 @@
           <w:i w:val="0"/>
           <w:sz w:val="22"/>
         </w:rPr>
-        <w:t>25. Jonas: Ich lese die Zeilen und muss lächeln. Ein Mann, der zwei Jahre geschwiegen hat, erzählt mir in drei Sätzen, dass seine Frau Kaffee gekocht hat. Das ist sein Weg, zu sagen, dass er nicht mehr allein ist.</w:t>
+        <w:t>36. Jonas: Ich lese die Zeilen und muss lächeln. Ein Mann, der zwei Jahre geschwiegen hat, erzählt mir in drei Sätzen, dass seine Frau Kaffee gekocht hat. Das ist sein Weg, zu sagen, dass er nicht mehr allein ist.</w:t>
       </w:r>
     </w:p>
     <w:p>
@@ -7691,7 +11057,7 @@
           <w:i w:val="0"/>
           <w:sz w:val="22"/>
         </w:rPr>
-        <w:t>26. Jonas: Am Abend, als ich nach Hause komme, liegt ein Brief von der Rechtsanwaltskammer im Briefkasten. Diesmal ist er dünn. Ich öffne ihn mit zitternden Fingern.</w:t>
+        <w:t>37. Jonas: Am Abend, als ich nach Hause komme, liegt ein Brief von der Rechtsanwaltskammer im Briefkasten. Diesmal ist er dünn. Ich öffne ihn mit zitternden Fingern.</w:t>
       </w:r>
     </w:p>
     <w:p>
@@ -7997,7 +11363,7 @@
           <w:i w:val="0"/>
           <w:sz w:val="22"/>
         </w:rPr>
-        <w:t>27. Jonas: „Das Verfahren wurde bis zur Klärung der staatsanwaltlichen Ermittlungen ausgesetzt. Eine Entscheidung ergeht zu gegebener Zeit." Ausgesetzt. Nicht eingestellt. Aber auch nicht fortgesetzt.</w:t>
+        <w:t>38. Jonas: „Das Verfahren wurde bis zur Klärung der staatsanwaltlichen Ermittlungen ausgesetzt. Eine Entscheidung ergeht zu gegebener Zeit." Ausgesetzt. Nicht eingestellt. Aber auch nicht fortgesetzt.</w:t>
       </w:r>
     </w:p>
     <w:p>
@@ -8303,7 +11669,7 @@
           <w:i w:val="0"/>
           <w:sz w:val="22"/>
         </w:rPr>
-        <w:t>28. Jonas: Ich lege den Brief auf den Tisch und setze mich daneben. Ein seltsamer Zustand: nicht freigesprochen, nicht verurteilt, einfach in der Schwebe. Wie ein Rad auf dem Höhepunkt eines Berges.</w:t>
+        <w:t>39. Jonas: Ich lege den Brief auf den Tisch und setze mich daneben. Ein seltsamer Zustand: nicht freigesprochen, nicht verurteilt, einfach in der Schwebe. Wie ein Rad auf dem Höhepunkt eines Berges.</w:t>
       </w:r>
     </w:p>
     <w:p>

</xml_diff>